<commit_message>
docs(report): bo sung khai bao AI da xac nhan va link commit minh chung
</commit_message>
<xml_diff>
--- a/Report/BaoCaoTuan1_24110363_24110369.docx
+++ b/Report/BaoCaoTuan1_24110363_24110369.docx
@@ -1,6 +1,6 @@
 
 <file path=word/document.xml><?xml version="1.0" encoding="utf-8"?>
-<w:document xmlns:wpc="http://schemas.microsoft.com/office/word/2010/wordprocessingCanvas" xmlns:cx="http://schemas.microsoft.com/office/drawing/2014/chartex" xmlns:cx1="http://schemas.microsoft.com/office/drawing/2015/9/8/chartex" xmlns:cx2="http://schemas.microsoft.com/office/drawing/2015/10/21/chartex" xmlns:cx3="http://schemas.microsoft.com/office/drawing/2016/5/9/chartex" xmlns:cx4="http://schemas.microsoft.com/office/drawing/2016/5/10/chartex" xmlns:cx5="http://schemas.microsoft.com/office/drawing/2016/5/11/chartex" xmlns:cx6="http://schemas.microsoft.com/office/drawing/2016/5/12/chartex" xmlns:cx7="http://schemas.microsoft.com/office/drawing/2016/5/13/chartex" xmlns:cx8="http://schemas.microsoft.com/office/drawing/2016/5/14/chartex" xmlns:mc="http://schemas.openxmlformats.org/markup-compatibility/2006" xmlns:aink="http://schemas.microsoft.com/office/drawing/2016/ink" xmlns:am3d="http://schemas.microsoft.com/office/drawing/2017/model3d" xmlns:o="urn:schemas-microsoft-com:office:office" xmlns:oel="http://schemas.microsoft.com/office/2019/extlst" xmlns:r="http://schemas.openxmlformats.org/officeDocument/2006/relationships" xmlns:m="http://schemas.openxmlformats.org/officeDocument/2006/math" xmlns:v="urn:schemas-microsoft-com:vml" xmlns:wp14="http://schemas.microsoft.com/office/word/2010/wordprocessingDrawing" xmlns:wp="http://schemas.openxmlformats.org/drawingml/2006/wordprocessingDrawing" xmlns:w10="urn:schemas-microsoft-com:office:word" xmlns:w="http://schemas.openxmlformats.org/wordprocessingml/2006/main" xmlns:w14="http://schemas.microsoft.com/office/word/2010/wordml" xmlns:w15="http://schemas.microsoft.com/office/word/2012/wordml" xmlns:w16cex="http://schemas.microsoft.com/office/word/2018/wordml/cex" xmlns:w16cid="http://schemas.microsoft.com/office/word/2016/wordml/cid" xmlns:w16="http://schemas.microsoft.com/office/word/2018/wordml" xmlns:w16du="http://schemas.microsoft.com/office/word/2023/wordml/word16du" xmlns:w16sdtdh="http://schemas.microsoft.com/office/word/2020/wordml/sdtdatahash" xmlns:w16sdtfl="http://schemas.microsoft.com/office/word/2024/wordml/sdtformatlock" xmlns:w16se="http://schemas.microsoft.com/office/word/2015/wordml/symex" xmlns:wpg="http://schemas.microsoft.com/office/word/2010/wordprocessingGroup" xmlns:wpi="http://schemas.microsoft.com/office/word/2010/wordprocessingInk" xmlns:wne="http://schemas.microsoft.com/office/word/2006/wordml" xmlns:wps="http://schemas.microsoft.com/office/word/2010/wordprocessingShape" mc:Ignorable="w14 w15 w16se w16cid w16 w16cex w16sdtdh w16sdtfl w16du wp14">
+<w:document xmlns:wpc="http://schemas.microsoft.com/office/word/2010/wordprocessingCanvas" xmlns:cx="http://schemas.microsoft.com/office/drawing/2014/chartex" xmlns:cx1="http://schemas.microsoft.com/office/drawing/2015/9/8/chartex" xmlns:cx2="http://schemas.microsoft.com/office/drawing/2015/10/21/chartex" xmlns:cx3="http://schemas.microsoft.com/office/drawing/2016/5/9/chartex" xmlns:cx4="http://schemas.microsoft.com/office/drawing/2016/5/10/chartex" xmlns:cx5="http://schemas.microsoft.com/office/drawing/2016/5/11/chartex" xmlns:cx6="http://schemas.microsoft.com/office/drawing/2016/5/12/chartex" xmlns:cx7="http://schemas.microsoft.com/office/drawing/2016/5/13/chartex" xmlns:cx8="http://schemas.microsoft.com/office/drawing/2016/5/14/chartex" xmlns:mc="http://schemas.openxmlformats.org/markup-compatibility/2006" xmlns:aink="http://schemas.microsoft.com/office/drawing/2016/ink" xmlns:am3d="http://schemas.microsoft.com/office/drawing/2017/model3d" xmlns:o="urn:schemas-microsoft-com:office:office" xmlns:r="http://schemas.openxmlformats.org/officeDocument/2006/relationships" xmlns:m="http://schemas.openxmlformats.org/officeDocument/2006/math" xmlns:v="urn:schemas-microsoft-com:vml" xmlns:wp14="http://schemas.microsoft.com/office/word/2010/wordprocessingDrawing" xmlns:wp="http://schemas.openxmlformats.org/drawingml/2006/wordprocessingDrawing" xmlns:w10="urn:schemas-microsoft-com:office:word" xmlns:w="http://schemas.openxmlformats.org/wordprocessingml/2006/main" xmlns:w14="http://schemas.microsoft.com/office/word/2010/wordml" xmlns:w15="http://schemas.microsoft.com/office/word/2012/wordml" xmlns:w16cex="http://schemas.microsoft.com/office/word/2018/wordml/cex" xmlns:w16cid="http://schemas.microsoft.com/office/word/2016/wordml/cid" xmlns:w16="http://schemas.microsoft.com/office/word/2018/wordml" xmlns:w16sdtdh="http://schemas.microsoft.com/office/word/2020/wordml/sdtdatahash" xmlns:w16se="http://schemas.microsoft.com/office/word/2015/wordml/symex" xmlns:wpg="http://schemas.microsoft.com/office/word/2010/wordprocessingGroup" xmlns:wpi="http://schemas.microsoft.com/office/word/2010/wordprocessingInk" xmlns:wne="http://schemas.microsoft.com/office/word/2006/wordml" xmlns:wps="http://schemas.microsoft.com/office/word/2010/wordprocessingShape" mc:Ignorable="w14 w15 w16se w16cid w16 w16cex w16sdtdh wp14">
   <w:body>
     <w:p>
       <w:pPr>
@@ -19,7 +19,7 @@
           <w:szCs w:val="28"/>
         </w:rPr>
         <w:drawing>
-          <wp:anchor distT="0" distB="0" distL="0" distR="0" simplePos="0" relativeHeight="251659264" behindDoc="1" locked="0" layoutInCell="1" allowOverlap="1" wp14:anchorId="56682BC7" wp14:editId="46189BC3">
+          <wp:anchor distT="0" distB="0" distL="0" distR="0" simplePos="0" relativeHeight="251659264" behindDoc="1" locked="0" layoutInCell="1" allowOverlap="1" wp14:anchorId="25201E7D" wp14:editId="5C3E5795">
             <wp:simplePos x="0" y="0"/>
             <wp:positionH relativeFrom="margin">
               <wp:posOffset>8060</wp:posOffset>
@@ -154,7 +154,7 @@
           <w:noProof/>
         </w:rPr>
         <w:drawing>
-          <wp:anchor distT="0" distB="0" distL="114300" distR="114300" simplePos="0" relativeHeight="251660288" behindDoc="0" locked="0" layoutInCell="1" allowOverlap="1" wp14:anchorId="277FFC8A" wp14:editId="5CD9688A">
+          <wp:anchor distT="0" distB="0" distL="114300" distR="114300" simplePos="0" relativeHeight="251660288" behindDoc="0" locked="0" layoutInCell="1" allowOverlap="1" wp14:anchorId="5EB2D57B" wp14:editId="0DB4AE2C">
             <wp:simplePos x="0" y="0"/>
             <wp:positionH relativeFrom="margin">
               <wp:align>center</wp:align>
@@ -798,6 +798,12 @@
     </w:p>
     <w:sdt>
       <w:sdtPr>
+        <w:rPr>
+          <w:rFonts w:ascii="Times New Roman" w:eastAsia="Times New Roman" w:hAnsi="Times New Roman" w:cs="Times New Roman"/>
+          <w:color w:val="auto"/>
+          <w:sz w:val="22"/>
+          <w:szCs w:val="22"/>
+        </w:rPr>
         <w:id w:val="1371644077"/>
         <w:docPartObj>
           <w:docPartGallery w:val="Table of Contents"/>
@@ -806,13 +812,9 @@
       </w:sdtPr>
       <w:sdtEndPr>
         <w:rPr>
-          <w:rFonts w:ascii="Times New Roman" w:eastAsia="Times New Roman" w:hAnsi="Times New Roman" w:cs="Times New Roman"/>
           <w:b/>
           <w:bCs/>
           <w:noProof/>
-          <w:color w:val="auto"/>
-          <w:sz w:val="22"/>
-          <w:szCs w:val="22"/>
         </w:rPr>
       </w:sdtEndPr>
       <w:sdtContent>
@@ -852,9 +854,8 @@
               <w:rFonts w:asciiTheme="minorHAnsi" w:eastAsiaTheme="minorEastAsia" w:hAnsiTheme="minorHAnsi" w:cstheme="minorBidi"/>
               <w:b w:val="0"/>
               <w:noProof/>
-              <w:kern w:val="2"/>
-              <w:sz w:val="24"/>
-              <w14:ligatures w14:val="standardContextual"/>
+              <w:sz w:val="22"/>
+              <w:szCs w:val="22"/>
             </w:rPr>
           </w:pPr>
           <w:r>
@@ -875,7 +876,7 @@
             </w:rPr>
             <w:fldChar w:fldCharType="separate"/>
           </w:r>
-          <w:hyperlink w:anchor="_Toc242621031" w:history="1">
+          <w:hyperlink w:anchor="_Toc242920024" w:history="1">
             <w:r>
               <w:rPr>
                 <w:rStyle w:val="Hyperlink"/>
@@ -902,7 +903,7 @@
                 <w:noProof/>
                 <w:webHidden/>
               </w:rPr>
-              <w:instrText xml:space="preserve"> PAGEREF _Toc242621031 \h </w:instrText>
+              <w:instrText xml:space="preserve"> PAGEREF _Toc242920024 \h </w:instrText>
             </w:r>
             <w:r>
               <w:rPr>
@@ -942,13 +943,11 @@
             <w:rPr>
               <w:rFonts w:asciiTheme="minorHAnsi" w:eastAsiaTheme="minorEastAsia" w:hAnsiTheme="minorHAnsi" w:cstheme="minorBidi"/>
               <w:noProof/>
-              <w:kern w:val="2"/>
-              <w:sz w:val="24"/>
-              <w:szCs w:val="24"/>
-              <w14:ligatures w14:val="standardContextual"/>
+              <w:sz w:val="22"/>
+              <w:szCs w:val="22"/>
             </w:rPr>
           </w:pPr>
-          <w:hyperlink w:anchor="_Toc242621032" w:history="1">
+          <w:hyperlink w:anchor="_Toc242920025" w:history="1">
             <w:r>
               <w:rPr>
                 <w:rStyle w:val="Hyperlink"/>
@@ -975,7 +974,7 @@
                 <w:noProof/>
                 <w:webHidden/>
               </w:rPr>
-              <w:instrText xml:space="preserve"> PAGEREF _Toc242621032 \h </w:instrText>
+              <w:instrText xml:space="preserve"> PAGEREF _Toc242920025 \h </w:instrText>
             </w:r>
             <w:r>
               <w:rPr>
@@ -1015,13 +1014,11 @@
             <w:rPr>
               <w:rFonts w:asciiTheme="minorHAnsi" w:eastAsiaTheme="minorEastAsia" w:hAnsiTheme="minorHAnsi" w:cstheme="minorBidi"/>
               <w:noProof/>
-              <w:kern w:val="2"/>
-              <w:sz w:val="24"/>
-              <w:szCs w:val="24"/>
-              <w14:ligatures w14:val="standardContextual"/>
+              <w:sz w:val="22"/>
+              <w:szCs w:val="22"/>
             </w:rPr>
           </w:pPr>
-          <w:hyperlink w:anchor="_Toc242621033" w:history="1">
+          <w:hyperlink w:anchor="_Toc242920026" w:history="1">
             <w:r>
               <w:rPr>
                 <w:rStyle w:val="Hyperlink"/>
@@ -1048,7 +1045,7 @@
                 <w:noProof/>
                 <w:webHidden/>
               </w:rPr>
-              <w:instrText xml:space="preserve"> PAGEREF _Toc242621033 \h </w:instrText>
+              <w:instrText xml:space="preserve"> PAGEREF _Toc242920026 \h </w:instrText>
             </w:r>
             <w:r>
               <w:rPr>
@@ -1089,12 +1086,11 @@
               <w:rFonts w:asciiTheme="minorHAnsi" w:eastAsiaTheme="minorEastAsia" w:hAnsiTheme="minorHAnsi" w:cstheme="minorBidi"/>
               <w:b w:val="0"/>
               <w:noProof/>
-              <w:kern w:val="2"/>
-              <w:sz w:val="24"/>
-              <w14:ligatures w14:val="standardContextual"/>
+              <w:sz w:val="22"/>
+              <w:szCs w:val="22"/>
             </w:rPr>
           </w:pPr>
-          <w:hyperlink w:anchor="_Toc242621034" w:history="1">
+          <w:hyperlink w:anchor="_Toc242920027" w:history="1">
             <w:r>
               <w:rPr>
                 <w:rStyle w:val="Hyperlink"/>
@@ -1121,7 +1117,7 @@
                 <w:noProof/>
                 <w:webHidden/>
               </w:rPr>
-              <w:instrText xml:space="preserve"> PAGEREF _Toc242621034 \h </w:instrText>
+              <w:instrText xml:space="preserve"> PAGEREF _Toc242920027 \h </w:instrText>
             </w:r>
             <w:r>
               <w:rPr>
@@ -1161,13 +1157,11 @@
             <w:rPr>
               <w:rFonts w:asciiTheme="minorHAnsi" w:eastAsiaTheme="minorEastAsia" w:hAnsiTheme="minorHAnsi" w:cstheme="minorBidi"/>
               <w:noProof/>
-              <w:kern w:val="2"/>
-              <w:sz w:val="24"/>
-              <w:szCs w:val="24"/>
-              <w14:ligatures w14:val="standardContextual"/>
+              <w:sz w:val="22"/>
+              <w:szCs w:val="22"/>
             </w:rPr>
           </w:pPr>
-          <w:hyperlink w:anchor="_Toc242621035" w:history="1">
+          <w:hyperlink w:anchor="_Toc242920028" w:history="1">
             <w:r>
               <w:rPr>
                 <w:rStyle w:val="Hyperlink"/>
@@ -1194,7 +1188,7 @@
                 <w:noProof/>
                 <w:webHidden/>
               </w:rPr>
-              <w:instrText xml:space="preserve"> PAGEREF _Toc242621035 \h </w:instrText>
+              <w:instrText xml:space="preserve"> PAGEREF _Toc242920028 \h </w:instrText>
             </w:r>
             <w:r>
               <w:rPr>
@@ -1234,13 +1228,11 @@
             <w:rPr>
               <w:rFonts w:asciiTheme="minorHAnsi" w:eastAsiaTheme="minorEastAsia" w:hAnsiTheme="minorHAnsi" w:cstheme="minorBidi"/>
               <w:noProof/>
-              <w:kern w:val="2"/>
-              <w:sz w:val="24"/>
-              <w:szCs w:val="24"/>
-              <w14:ligatures w14:val="standardContextual"/>
+              <w:sz w:val="22"/>
+              <w:szCs w:val="22"/>
             </w:rPr>
           </w:pPr>
-          <w:hyperlink w:anchor="_Toc242621036" w:history="1">
+          <w:hyperlink w:anchor="_Toc242920029" w:history="1">
             <w:r>
               <w:rPr>
                 <w:rStyle w:val="Hyperlink"/>
@@ -1267,7 +1259,7 @@
                 <w:noProof/>
                 <w:webHidden/>
               </w:rPr>
-              <w:instrText xml:space="preserve"> PAGEREF _Toc242621036 \h </w:instrText>
+              <w:instrText xml:space="preserve"> PAGEREF _Toc242920029 \h </w:instrText>
             </w:r>
             <w:r>
               <w:rPr>
@@ -1308,12 +1300,11 @@
               <w:rFonts w:asciiTheme="minorHAnsi" w:eastAsiaTheme="minorEastAsia" w:hAnsiTheme="minorHAnsi" w:cstheme="minorBidi"/>
               <w:b w:val="0"/>
               <w:noProof/>
-              <w:kern w:val="2"/>
-              <w:sz w:val="24"/>
-              <w14:ligatures w14:val="standardContextual"/>
+              <w:sz w:val="22"/>
+              <w:szCs w:val="22"/>
             </w:rPr>
           </w:pPr>
-          <w:hyperlink w:anchor="_Toc242621037" w:history="1">
+          <w:hyperlink w:anchor="_Toc242920030" w:history="1">
             <w:r>
               <w:rPr>
                 <w:rStyle w:val="Hyperlink"/>
@@ -1340,7 +1331,7 @@
                 <w:noProof/>
                 <w:webHidden/>
               </w:rPr>
-              <w:instrText xml:space="preserve"> PAGEREF _Toc242621037 \h </w:instrText>
+              <w:instrText xml:space="preserve"> PAGEREF _Toc242920030 \h </w:instrText>
             </w:r>
             <w:r>
               <w:rPr>
@@ -1380,13 +1371,11 @@
             <w:rPr>
               <w:rFonts w:asciiTheme="minorHAnsi" w:eastAsiaTheme="minorEastAsia" w:hAnsiTheme="minorHAnsi" w:cstheme="minorBidi"/>
               <w:noProof/>
-              <w:kern w:val="2"/>
-              <w:sz w:val="24"/>
-              <w:szCs w:val="24"/>
-              <w14:ligatures w14:val="standardContextual"/>
+              <w:sz w:val="22"/>
+              <w:szCs w:val="22"/>
             </w:rPr>
           </w:pPr>
-          <w:hyperlink w:anchor="_Toc242621038" w:history="1">
+          <w:hyperlink w:anchor="_Toc242920031" w:history="1">
             <w:r>
               <w:rPr>
                 <w:rStyle w:val="Hyperlink"/>
@@ -1413,7 +1402,7 @@
                 <w:noProof/>
                 <w:webHidden/>
               </w:rPr>
-              <w:instrText xml:space="preserve"> PAGEREF _Toc242621038 \h </w:instrText>
+              <w:instrText xml:space="preserve"> PAGEREF _Toc242920031 \h </w:instrText>
             </w:r>
             <w:r>
               <w:rPr>
@@ -1453,13 +1442,11 @@
             <w:rPr>
               <w:rFonts w:asciiTheme="minorHAnsi" w:eastAsiaTheme="minorEastAsia" w:hAnsiTheme="minorHAnsi" w:cstheme="minorBidi"/>
               <w:noProof/>
-              <w:kern w:val="2"/>
-              <w:sz w:val="24"/>
-              <w:szCs w:val="24"/>
-              <w14:ligatures w14:val="standardContextual"/>
+              <w:sz w:val="22"/>
+              <w:szCs w:val="22"/>
             </w:rPr>
           </w:pPr>
-          <w:hyperlink w:anchor="_Toc242621039" w:history="1">
+          <w:hyperlink w:anchor="_Toc242920032" w:history="1">
             <w:r>
               <w:rPr>
                 <w:rStyle w:val="Hyperlink"/>
@@ -1486,7 +1473,7 @@
                 <w:noProof/>
                 <w:webHidden/>
               </w:rPr>
-              <w:instrText xml:space="preserve"> PAGEREF _Toc242621039 \h </w:instrText>
+              <w:instrText xml:space="preserve"> PAGEREF _Toc242920032 \h </w:instrText>
             </w:r>
             <w:r>
               <w:rPr>
@@ -1526,13 +1513,11 @@
             <w:rPr>
               <w:rFonts w:asciiTheme="minorHAnsi" w:eastAsiaTheme="minorEastAsia" w:hAnsiTheme="minorHAnsi" w:cstheme="minorBidi"/>
               <w:noProof/>
-              <w:kern w:val="2"/>
-              <w:sz w:val="24"/>
-              <w:szCs w:val="24"/>
-              <w14:ligatures w14:val="standardContextual"/>
+              <w:sz w:val="22"/>
+              <w:szCs w:val="22"/>
             </w:rPr>
           </w:pPr>
-          <w:hyperlink w:anchor="_Toc242621040" w:history="1">
+          <w:hyperlink w:anchor="_Toc242920033" w:history="1">
             <w:r>
               <w:rPr>
                 <w:rStyle w:val="Hyperlink"/>
@@ -1559,7 +1544,7 @@
                 <w:noProof/>
                 <w:webHidden/>
               </w:rPr>
-              <w:instrText xml:space="preserve"> PAGEREF _Toc242621040 \h </w:instrText>
+              <w:instrText xml:space="preserve"> PAGEREF _Toc242920033 \h </w:instrText>
             </w:r>
             <w:r>
               <w:rPr>
@@ -1599,13 +1584,11 @@
             <w:rPr>
               <w:rFonts w:asciiTheme="minorHAnsi" w:eastAsiaTheme="minorEastAsia" w:hAnsiTheme="minorHAnsi" w:cstheme="minorBidi"/>
               <w:noProof/>
-              <w:kern w:val="2"/>
-              <w:sz w:val="24"/>
-              <w:szCs w:val="24"/>
-              <w14:ligatures w14:val="standardContextual"/>
+              <w:sz w:val="22"/>
+              <w:szCs w:val="22"/>
             </w:rPr>
           </w:pPr>
-          <w:hyperlink w:anchor="_Toc242621041" w:history="1">
+          <w:hyperlink w:anchor="_Toc242920034" w:history="1">
             <w:r>
               <w:rPr>
                 <w:rStyle w:val="Hyperlink"/>
@@ -1632,7 +1615,7 @@
                 <w:noProof/>
                 <w:webHidden/>
               </w:rPr>
-              <w:instrText xml:space="preserve"> PAGEREF _Toc242621041 \h </w:instrText>
+              <w:instrText xml:space="preserve"> PAGEREF _Toc242920034 \h </w:instrText>
             </w:r>
             <w:r>
               <w:rPr>
@@ -1672,13 +1655,11 @@
             <w:rPr>
               <w:rFonts w:asciiTheme="minorHAnsi" w:eastAsiaTheme="minorEastAsia" w:hAnsiTheme="minorHAnsi" w:cstheme="minorBidi"/>
               <w:noProof/>
-              <w:kern w:val="2"/>
-              <w:sz w:val="24"/>
-              <w:szCs w:val="24"/>
-              <w14:ligatures w14:val="standardContextual"/>
+              <w:sz w:val="22"/>
+              <w:szCs w:val="22"/>
             </w:rPr>
           </w:pPr>
-          <w:hyperlink w:anchor="_Toc242621042" w:history="1">
+          <w:hyperlink w:anchor="_Toc242920035" w:history="1">
             <w:r>
               <w:rPr>
                 <w:rStyle w:val="Hyperlink"/>
@@ -1705,7 +1686,7 @@
                 <w:noProof/>
                 <w:webHidden/>
               </w:rPr>
-              <w:instrText xml:space="preserve"> PAGEREF _Toc242621042 \h </w:instrText>
+              <w:instrText xml:space="preserve"> PAGEREF _Toc242920035 \h </w:instrText>
             </w:r>
             <w:r>
               <w:rPr>
@@ -1745,13 +1726,10 @@
             <w:rPr>
               <w:rFonts w:asciiTheme="minorHAnsi" w:eastAsiaTheme="minorEastAsia" w:hAnsiTheme="minorHAnsi" w:cstheme="minorBidi"/>
               <w:noProof/>
-              <w:kern w:val="2"/>
-              <w:sz w:val="24"/>
-              <w:szCs w:val="24"/>
-              <w14:ligatures w14:val="standardContextual"/>
+              <w:sz w:val="22"/>
             </w:rPr>
           </w:pPr>
-          <w:hyperlink w:anchor="_Toc242621043" w:history="1">
+          <w:hyperlink w:anchor="_Toc242920036" w:history="1">
             <w:r>
               <w:rPr>
                 <w:rStyle w:val="Hyperlink"/>
@@ -1778,7 +1756,7 @@
                 <w:noProof/>
                 <w:webHidden/>
               </w:rPr>
-              <w:instrText xml:space="preserve"> PAGEREF _Toc242621043 \h </w:instrText>
+              <w:instrText xml:space="preserve"> PAGEREF _Toc242920036 \h </w:instrText>
             </w:r>
             <w:r>
               <w:rPr>
@@ -1818,13 +1796,10 @@
             <w:rPr>
               <w:rFonts w:asciiTheme="minorHAnsi" w:eastAsiaTheme="minorEastAsia" w:hAnsiTheme="minorHAnsi" w:cstheme="minorBidi"/>
               <w:noProof/>
-              <w:kern w:val="2"/>
-              <w:sz w:val="24"/>
-              <w:szCs w:val="24"/>
-              <w14:ligatures w14:val="standardContextual"/>
+              <w:sz w:val="22"/>
             </w:rPr>
           </w:pPr>
-          <w:hyperlink w:anchor="_Toc242621044" w:history="1">
+          <w:hyperlink w:anchor="_Toc242920037" w:history="1">
             <w:r>
               <w:rPr>
                 <w:rStyle w:val="Hyperlink"/>
@@ -1851,7 +1826,7 @@
                 <w:noProof/>
                 <w:webHidden/>
               </w:rPr>
-              <w:instrText xml:space="preserve"> PAGEREF _Toc242621044 \h </w:instrText>
+              <w:instrText xml:space="preserve"> PAGEREF _Toc242920037 \h </w:instrText>
             </w:r>
             <w:r>
               <w:rPr>
@@ -1891,13 +1866,10 @@
             <w:rPr>
               <w:rFonts w:asciiTheme="minorHAnsi" w:eastAsiaTheme="minorEastAsia" w:hAnsiTheme="minorHAnsi" w:cstheme="minorBidi"/>
               <w:noProof/>
-              <w:kern w:val="2"/>
-              <w:sz w:val="24"/>
-              <w:szCs w:val="24"/>
-              <w14:ligatures w14:val="standardContextual"/>
+              <w:sz w:val="22"/>
             </w:rPr>
           </w:pPr>
-          <w:hyperlink w:anchor="_Toc242621045" w:history="1">
+          <w:hyperlink w:anchor="_Toc242920038" w:history="1">
             <w:r>
               <w:rPr>
                 <w:rStyle w:val="Hyperlink"/>
@@ -1924,7 +1896,7 @@
                 <w:noProof/>
                 <w:webHidden/>
               </w:rPr>
-              <w:instrText xml:space="preserve"> PAGEREF _Toc242621045 \h </w:instrText>
+              <w:instrText xml:space="preserve"> PAGEREF _Toc242920038 \h </w:instrText>
             </w:r>
             <w:r>
               <w:rPr>
@@ -1964,13 +1936,11 @@
             <w:rPr>
               <w:rFonts w:asciiTheme="minorHAnsi" w:eastAsiaTheme="minorEastAsia" w:hAnsiTheme="minorHAnsi" w:cstheme="minorBidi"/>
               <w:noProof/>
-              <w:kern w:val="2"/>
-              <w:sz w:val="24"/>
-              <w:szCs w:val="24"/>
-              <w14:ligatures w14:val="standardContextual"/>
+              <w:sz w:val="22"/>
+              <w:szCs w:val="22"/>
             </w:rPr>
           </w:pPr>
-          <w:hyperlink w:anchor="_Toc242621046" w:history="1">
+          <w:hyperlink w:anchor="_Toc242920039" w:history="1">
             <w:r>
               <w:rPr>
                 <w:rStyle w:val="Hyperlink"/>
@@ -1997,7 +1967,7 @@
                 <w:noProof/>
                 <w:webHidden/>
               </w:rPr>
-              <w:instrText xml:space="preserve"> PAGEREF _Toc242621046 \h </w:instrText>
+              <w:instrText xml:space="preserve"> PAGEREF _Toc242920039 \h </w:instrText>
             </w:r>
             <w:r>
               <w:rPr>
@@ -2037,13 +2007,11 @@
             <w:rPr>
               <w:rFonts w:asciiTheme="minorHAnsi" w:eastAsiaTheme="minorEastAsia" w:hAnsiTheme="minorHAnsi" w:cstheme="minorBidi"/>
               <w:noProof/>
-              <w:kern w:val="2"/>
-              <w:sz w:val="24"/>
-              <w:szCs w:val="24"/>
-              <w14:ligatures w14:val="standardContextual"/>
+              <w:sz w:val="22"/>
+              <w:szCs w:val="22"/>
             </w:rPr>
           </w:pPr>
-          <w:hyperlink w:anchor="_Toc242621047" w:history="1">
+          <w:hyperlink w:anchor="_Toc242920040" w:history="1">
             <w:r>
               <w:rPr>
                 <w:rStyle w:val="Hyperlink"/>
@@ -2070,7 +2038,7 @@
                 <w:noProof/>
                 <w:webHidden/>
               </w:rPr>
-              <w:instrText xml:space="preserve"> PAGEREF _Toc242621047 \h </w:instrText>
+              <w:instrText xml:space="preserve"> PAGEREF _Toc242920040 \h </w:instrText>
             </w:r>
             <w:r>
               <w:rPr>
@@ -2110,13 +2078,11 @@
             <w:rPr>
               <w:rFonts w:asciiTheme="minorHAnsi" w:eastAsiaTheme="minorEastAsia" w:hAnsiTheme="minorHAnsi" w:cstheme="minorBidi"/>
               <w:noProof/>
-              <w:kern w:val="2"/>
-              <w:sz w:val="24"/>
-              <w:szCs w:val="24"/>
-              <w14:ligatures w14:val="standardContextual"/>
+              <w:sz w:val="22"/>
+              <w:szCs w:val="22"/>
             </w:rPr>
           </w:pPr>
-          <w:hyperlink w:anchor="_Toc242621048" w:history="1">
+          <w:hyperlink w:anchor="_Toc242920041" w:history="1">
             <w:r>
               <w:rPr>
                 <w:rStyle w:val="Hyperlink"/>
@@ -2143,7 +2109,7 @@
                 <w:noProof/>
                 <w:webHidden/>
               </w:rPr>
-              <w:instrText xml:space="preserve"> PAGEREF _Toc242621048 \h </w:instrText>
+              <w:instrText xml:space="preserve"> PAGEREF _Toc242920041 \h </w:instrText>
             </w:r>
             <w:r>
               <w:rPr>
@@ -2184,12 +2150,11 @@
               <w:rFonts w:asciiTheme="minorHAnsi" w:eastAsiaTheme="minorEastAsia" w:hAnsiTheme="minorHAnsi" w:cstheme="minorBidi"/>
               <w:b w:val="0"/>
               <w:noProof/>
-              <w:kern w:val="2"/>
-              <w:sz w:val="24"/>
-              <w14:ligatures w14:val="standardContextual"/>
+              <w:sz w:val="22"/>
+              <w:szCs w:val="22"/>
             </w:rPr>
           </w:pPr>
-          <w:hyperlink w:anchor="_Toc242621049" w:history="1">
+          <w:hyperlink w:anchor="_Toc242920042" w:history="1">
             <w:r>
               <w:rPr>
                 <w:rStyle w:val="Hyperlink"/>
@@ -2216,7 +2181,7 @@
                 <w:noProof/>
                 <w:webHidden/>
               </w:rPr>
-              <w:instrText xml:space="preserve"> PAGEREF _Toc242621049 \h </w:instrText>
+              <w:instrText xml:space="preserve"> PAGEREF _Toc242920042 \h </w:instrText>
             </w:r>
             <w:r>
               <w:rPr>
@@ -2256,13 +2221,11 @@
             <w:rPr>
               <w:rFonts w:asciiTheme="minorHAnsi" w:eastAsiaTheme="minorEastAsia" w:hAnsiTheme="minorHAnsi" w:cstheme="minorBidi"/>
               <w:noProof/>
-              <w:kern w:val="2"/>
-              <w:sz w:val="24"/>
-              <w:szCs w:val="24"/>
-              <w14:ligatures w14:val="standardContextual"/>
+              <w:sz w:val="22"/>
+              <w:szCs w:val="22"/>
             </w:rPr>
           </w:pPr>
-          <w:hyperlink w:anchor="_Toc242621050" w:history="1">
+          <w:hyperlink w:anchor="_Toc242920043" w:history="1">
             <w:r>
               <w:rPr>
                 <w:rStyle w:val="Hyperlink"/>
@@ -2289,7 +2252,7 @@
                 <w:noProof/>
                 <w:webHidden/>
               </w:rPr>
-              <w:instrText xml:space="preserve"> PAGEREF _Toc242621050 \h </w:instrText>
+              <w:instrText xml:space="preserve"> PAGEREF _Toc242920043 \h </w:instrText>
             </w:r>
             <w:r>
               <w:rPr>
@@ -2329,13 +2292,11 @@
             <w:rPr>
               <w:rFonts w:asciiTheme="minorHAnsi" w:eastAsiaTheme="minorEastAsia" w:hAnsiTheme="minorHAnsi" w:cstheme="minorBidi"/>
               <w:noProof/>
-              <w:kern w:val="2"/>
-              <w:sz w:val="24"/>
-              <w:szCs w:val="24"/>
-              <w14:ligatures w14:val="standardContextual"/>
+              <w:sz w:val="22"/>
+              <w:szCs w:val="22"/>
             </w:rPr>
           </w:pPr>
-          <w:hyperlink w:anchor="_Toc242621051" w:history="1">
+          <w:hyperlink w:anchor="_Toc242920044" w:history="1">
             <w:r>
               <w:rPr>
                 <w:rStyle w:val="Hyperlink"/>
@@ -2362,7 +2323,7 @@
                 <w:noProof/>
                 <w:webHidden/>
               </w:rPr>
-              <w:instrText xml:space="preserve"> PAGEREF _Toc242621051 \h </w:instrText>
+              <w:instrText xml:space="preserve"> PAGEREF _Toc242920044 \h </w:instrText>
             </w:r>
             <w:r>
               <w:rPr>
@@ -2402,13 +2363,11 @@
             <w:rPr>
               <w:rFonts w:asciiTheme="minorHAnsi" w:eastAsiaTheme="minorEastAsia" w:hAnsiTheme="minorHAnsi" w:cstheme="minorBidi"/>
               <w:noProof/>
-              <w:kern w:val="2"/>
-              <w:sz w:val="24"/>
-              <w:szCs w:val="24"/>
-              <w14:ligatures w14:val="standardContextual"/>
+              <w:sz w:val="22"/>
+              <w:szCs w:val="22"/>
             </w:rPr>
           </w:pPr>
-          <w:hyperlink w:anchor="_Toc242621052" w:history="1">
+          <w:hyperlink w:anchor="_Toc242920045" w:history="1">
             <w:r>
               <w:rPr>
                 <w:rStyle w:val="Hyperlink"/>
@@ -2435,7 +2394,7 @@
                 <w:noProof/>
                 <w:webHidden/>
               </w:rPr>
-              <w:instrText xml:space="preserve"> PAGEREF _Toc242621052 \h </w:instrText>
+              <w:instrText xml:space="preserve"> PAGEREF _Toc242920045 \h </w:instrText>
             </w:r>
             <w:r>
               <w:rPr>
@@ -2456,6 +2415,287 @@
                 <w:webHidden/>
               </w:rPr>
               <w:t>13</w:t>
+            </w:r>
+            <w:r>
+              <w:rPr>
+                <w:noProof/>
+                <w:webHidden/>
+              </w:rPr>
+              <w:fldChar w:fldCharType="end"/>
+            </w:r>
+          </w:hyperlink>
+        </w:p>
+        <w:p>
+          <w:pPr>
+            <w:pStyle w:val="TOC2"/>
+            <w:tabs>
+              <w:tab w:val="right" w:leader="dot" w:pos="8777"/>
+            </w:tabs>
+            <w:rPr>
+              <w:rFonts w:asciiTheme="minorHAnsi" w:eastAsiaTheme="minorEastAsia" w:hAnsiTheme="minorHAnsi" w:cstheme="minorBidi"/>
+              <w:noProof/>
+              <w:sz w:val="22"/>
+              <w:szCs w:val="22"/>
+            </w:rPr>
+          </w:pPr>
+          <w:hyperlink w:anchor="_Toc242920046" w:history="1">
+            <w:r>
+              <w:rPr>
+                <w:rStyle w:val="Hyperlink"/>
+                <w:noProof/>
+              </w:rPr>
+              <w:t>4.4. Khai báo sử dụng AI và minh chứng hoàn thiện</w:t>
+            </w:r>
+            <w:r>
+              <w:rPr>
+                <w:noProof/>
+                <w:webHidden/>
+              </w:rPr>
+              <w:tab/>
+            </w:r>
+            <w:r>
+              <w:rPr>
+                <w:noProof/>
+                <w:webHidden/>
+              </w:rPr>
+              <w:fldChar w:fldCharType="begin"/>
+            </w:r>
+            <w:r>
+              <w:rPr>
+                <w:noProof/>
+                <w:webHidden/>
+              </w:rPr>
+              <w:instrText xml:space="preserve"> PAGEREF _Toc242920046 \h </w:instrText>
+            </w:r>
+            <w:r>
+              <w:rPr>
+                <w:noProof/>
+                <w:webHidden/>
+              </w:rPr>
+            </w:r>
+            <w:r>
+              <w:rPr>
+                <w:noProof/>
+                <w:webHidden/>
+              </w:rPr>
+              <w:fldChar w:fldCharType="separate"/>
+            </w:r>
+            <w:r>
+              <w:rPr>
+                <w:noProof/>
+                <w:webHidden/>
+              </w:rPr>
+              <w:t>14</w:t>
+            </w:r>
+            <w:r>
+              <w:rPr>
+                <w:noProof/>
+                <w:webHidden/>
+              </w:rPr>
+              <w:fldChar w:fldCharType="end"/>
+            </w:r>
+          </w:hyperlink>
+        </w:p>
+        <w:p>
+          <w:pPr>
+            <w:pStyle w:val="TOC3"/>
+            <w:tabs>
+              <w:tab w:val="right" w:leader="dot" w:pos="8777"/>
+            </w:tabs>
+            <w:rPr>
+              <w:rFonts w:asciiTheme="minorHAnsi" w:eastAsiaTheme="minorEastAsia" w:hAnsiTheme="minorHAnsi" w:cstheme="minorBidi"/>
+              <w:noProof/>
+              <w:sz w:val="22"/>
+            </w:rPr>
+          </w:pPr>
+          <w:hyperlink w:anchor="_Toc242920047" w:history="1">
+            <w:r>
+              <w:rPr>
+                <w:rStyle w:val="Hyperlink"/>
+                <w:noProof/>
+              </w:rPr>
+              <w:t>4.4.1. ChatGPT — Hỗ trợ mã nguồn, hướng dẫn cấu hình và rà soát báo cáo</w:t>
+            </w:r>
+            <w:r>
+              <w:rPr>
+                <w:noProof/>
+                <w:webHidden/>
+              </w:rPr>
+              <w:tab/>
+            </w:r>
+            <w:r>
+              <w:rPr>
+                <w:noProof/>
+                <w:webHidden/>
+              </w:rPr>
+              <w:fldChar w:fldCharType="begin"/>
+            </w:r>
+            <w:r>
+              <w:rPr>
+                <w:noProof/>
+                <w:webHidden/>
+              </w:rPr>
+              <w:instrText xml:space="preserve"> PAGEREF _Toc242920047 \h </w:instrText>
+            </w:r>
+            <w:r>
+              <w:rPr>
+                <w:noProof/>
+                <w:webHidden/>
+              </w:rPr>
+            </w:r>
+            <w:r>
+              <w:rPr>
+                <w:noProof/>
+                <w:webHidden/>
+              </w:rPr>
+              <w:fldChar w:fldCharType="separate"/>
+            </w:r>
+            <w:r>
+              <w:rPr>
+                <w:noProof/>
+                <w:webHidden/>
+              </w:rPr>
+              <w:t>14</w:t>
+            </w:r>
+            <w:r>
+              <w:rPr>
+                <w:noProof/>
+                <w:webHidden/>
+              </w:rPr>
+              <w:fldChar w:fldCharType="end"/>
+            </w:r>
+          </w:hyperlink>
+        </w:p>
+        <w:p>
+          <w:pPr>
+            <w:pStyle w:val="TOC3"/>
+            <w:tabs>
+              <w:tab w:val="right" w:leader="dot" w:pos="8777"/>
+            </w:tabs>
+            <w:rPr>
+              <w:rFonts w:asciiTheme="minorHAnsi" w:eastAsiaTheme="minorEastAsia" w:hAnsiTheme="minorHAnsi" w:cstheme="minorBidi"/>
+              <w:noProof/>
+              <w:sz w:val="22"/>
+            </w:rPr>
+          </w:pPr>
+          <w:hyperlink w:anchor="_Toc242920048" w:history="1">
+            <w:r>
+              <w:rPr>
+                <w:rStyle w:val="Hyperlink"/>
+                <w:noProof/>
+              </w:rPr>
+              <w:t>4.4.2. Google Gemini — Tóm lược, rà soát commit và hướng dẫn trình bày Markdown</w:t>
+            </w:r>
+            <w:r>
+              <w:rPr>
+                <w:noProof/>
+                <w:webHidden/>
+              </w:rPr>
+              <w:tab/>
+            </w:r>
+            <w:r>
+              <w:rPr>
+                <w:noProof/>
+                <w:webHidden/>
+              </w:rPr>
+              <w:fldChar w:fldCharType="begin"/>
+            </w:r>
+            <w:r>
+              <w:rPr>
+                <w:noProof/>
+                <w:webHidden/>
+              </w:rPr>
+              <w:instrText xml:space="preserve"> PAGEREF _Toc242920048 \h </w:instrText>
+            </w:r>
+            <w:r>
+              <w:rPr>
+                <w:noProof/>
+                <w:webHidden/>
+              </w:rPr>
+            </w:r>
+            <w:r>
+              <w:rPr>
+                <w:noProof/>
+                <w:webHidden/>
+              </w:rPr>
+              <w:fldChar w:fldCharType="separate"/>
+            </w:r>
+            <w:r>
+              <w:rPr>
+                <w:noProof/>
+                <w:webHidden/>
+              </w:rPr>
+              <w:t>15</w:t>
+            </w:r>
+            <w:r>
+              <w:rPr>
+                <w:noProof/>
+                <w:webHidden/>
+              </w:rPr>
+              <w:fldChar w:fldCharType="end"/>
+            </w:r>
+          </w:hyperlink>
+        </w:p>
+        <w:p>
+          <w:pPr>
+            <w:pStyle w:val="TOC3"/>
+            <w:tabs>
+              <w:tab w:val="right" w:leader="dot" w:pos="8777"/>
+            </w:tabs>
+            <w:rPr>
+              <w:rFonts w:asciiTheme="minorHAnsi" w:eastAsiaTheme="minorEastAsia" w:hAnsiTheme="minorHAnsi" w:cstheme="minorBidi"/>
+              <w:noProof/>
+              <w:sz w:val="22"/>
+            </w:rPr>
+          </w:pPr>
+          <w:hyperlink w:anchor="_Toc242920049" w:history="1">
+            <w:r>
+              <w:rPr>
+                <w:rStyle w:val="Hyperlink"/>
+                <w:noProof/>
+              </w:rPr>
+              <w:t>4.4.3. Danh mục ảnh cấu hình và phạm vi minh chứng</w:t>
+            </w:r>
+            <w:r>
+              <w:rPr>
+                <w:noProof/>
+                <w:webHidden/>
+              </w:rPr>
+              <w:tab/>
+            </w:r>
+            <w:r>
+              <w:rPr>
+                <w:noProof/>
+                <w:webHidden/>
+              </w:rPr>
+              <w:fldChar w:fldCharType="begin"/>
+            </w:r>
+            <w:r>
+              <w:rPr>
+                <w:noProof/>
+                <w:webHidden/>
+              </w:rPr>
+              <w:instrText xml:space="preserve"> PAGEREF _Toc242920049 \h </w:instrText>
+            </w:r>
+            <w:r>
+              <w:rPr>
+                <w:noProof/>
+                <w:webHidden/>
+              </w:rPr>
+            </w:r>
+            <w:r>
+              <w:rPr>
+                <w:noProof/>
+                <w:webHidden/>
+              </w:rPr>
+              <w:fldChar w:fldCharType="separate"/>
+            </w:r>
+            <w:r>
+              <w:rPr>
+                <w:noProof/>
+                <w:webHidden/>
+              </w:rPr>
+              <w:t>16</w:t>
             </w:r>
             <w:r>
               <w:rPr>
@@ -2476,12 +2716,11 @@
               <w:rFonts w:asciiTheme="minorHAnsi" w:eastAsiaTheme="minorEastAsia" w:hAnsiTheme="minorHAnsi" w:cstheme="minorBidi"/>
               <w:b w:val="0"/>
               <w:noProof/>
-              <w:kern w:val="2"/>
-              <w:sz w:val="24"/>
-              <w14:ligatures w14:val="standardContextual"/>
+              <w:sz w:val="22"/>
+              <w:szCs w:val="22"/>
             </w:rPr>
           </w:pPr>
-          <w:hyperlink w:anchor="_Toc242621053" w:history="1">
+          <w:hyperlink w:anchor="_Toc242920050" w:history="1">
             <w:r>
               <w:rPr>
                 <w:rStyle w:val="Hyperlink"/>
@@ -2508,7 +2747,7 @@
                 <w:noProof/>
                 <w:webHidden/>
               </w:rPr>
-              <w:instrText xml:space="preserve"> PAGEREF _Toc242621053 \h </w:instrText>
+              <w:instrText xml:space="preserve"> PAGEREF _Toc242920050 \h </w:instrText>
             </w:r>
             <w:r>
               <w:rPr>
@@ -2528,7 +2767,7 @@
                 <w:noProof/>
                 <w:webHidden/>
               </w:rPr>
-              <w:t>14</w:t>
+              <w:t>17</w:t>
             </w:r>
             <w:r>
               <w:rPr>
@@ -2546,6 +2785,7 @@
               <w:sz w:val="26"/>
               <w:szCs w:val="24"/>
             </w:rPr>
+            <w:lastRenderedPageBreak/>
             <w:fldChar w:fldCharType="end"/>
           </w:r>
         </w:p>
@@ -2578,7 +2818,7 @@
         </w:rPr>
       </w:pPr>
       <w:bookmarkStart w:id="0" w:name="_Toc242620474"/>
-      <w:bookmarkStart w:id="1" w:name="_Toc242621031"/>
+      <w:bookmarkStart w:id="1" w:name="_Toc242920024"/>
       <w:r>
         <w:rPr>
           <w:sz w:val="26"/>
@@ -2599,7 +2839,7 @@
         </w:rPr>
       </w:pPr>
       <w:bookmarkStart w:id="2" w:name="_Toc242620475"/>
-      <w:bookmarkStart w:id="3" w:name="_Toc242621032"/>
+      <w:bookmarkStart w:id="3" w:name="_Toc242920025"/>
       <w:r>
         <w:rPr>
           <w:szCs w:val="26"/>
@@ -2638,7 +2878,7 @@
         </w:rPr>
       </w:pPr>
       <w:bookmarkStart w:id="4" w:name="_Toc242620476"/>
-      <w:bookmarkStart w:id="5" w:name="_Toc242621033"/>
+      <w:bookmarkStart w:id="5" w:name="_Toc242920026"/>
       <w:r>
         <w:rPr>
           <w:szCs w:val="26"/>
@@ -2690,7 +2930,7 @@
         </w:rPr>
       </w:pPr>
       <w:bookmarkStart w:id="6" w:name="_Toc242620477"/>
-      <w:bookmarkStart w:id="7" w:name="_Toc242621034"/>
+      <w:bookmarkStart w:id="7" w:name="_Toc242920027"/>
       <w:r>
         <w:rPr>
           <w:sz w:val="26"/>
@@ -2711,7 +2951,7 @@
         </w:rPr>
       </w:pPr>
       <w:bookmarkStart w:id="8" w:name="_Toc242620478"/>
-      <w:bookmarkStart w:id="9" w:name="_Toc242621035"/>
+      <w:bookmarkStart w:id="9" w:name="_Toc242920028"/>
       <w:r>
         <w:rPr>
           <w:szCs w:val="26"/>
@@ -2732,7 +2972,7 @@
           <w:noProof/>
         </w:rPr>
         <w:drawing>
-          <wp:inline distT="0" distB="0" distL="0" distR="0" wp14:anchorId="6F6CC8C1" wp14:editId="3B5E8E52">
+          <wp:inline distT="0" distB="0" distL="0" distR="0" wp14:anchorId="678A8355" wp14:editId="47DD3A4E">
             <wp:extent cx="5417788" cy="2952000"/>
             <wp:effectExtent l="0" t="0" r="0" b="0"/>
             <wp:docPr id="1001" name="Cloud Photo figure 1" descr="Kiến trúc hệ thống xử lý ảnh tự động trên AWS"/>
@@ -2805,7 +3045,7 @@
         </w:rPr>
       </w:pPr>
       <w:bookmarkStart w:id="10" w:name="_Toc242620479"/>
-      <w:bookmarkStart w:id="11" w:name="_Toc242621036"/>
+      <w:bookmarkStart w:id="11" w:name="_Toc242920029"/>
       <w:r>
         <w:rPr>
           <w:szCs w:val="26"/>
@@ -2857,7 +3097,7 @@
         </w:rPr>
       </w:pPr>
       <w:bookmarkStart w:id="12" w:name="_Toc242620480"/>
-      <w:bookmarkStart w:id="13" w:name="_Toc242621037"/>
+      <w:bookmarkStart w:id="13" w:name="_Toc242920030"/>
       <w:r>
         <w:rPr>
           <w:sz w:val="26"/>
@@ -2878,7 +3118,7 @@
         </w:rPr>
       </w:pPr>
       <w:bookmarkStart w:id="14" w:name="_Toc242620481"/>
-      <w:bookmarkStart w:id="15" w:name="_Toc242621038"/>
+      <w:bookmarkStart w:id="15" w:name="_Toc242920031"/>
       <w:r>
         <w:rPr>
           <w:szCs w:val="26"/>
@@ -2909,7 +3149,7 @@
           <w:noProof/>
         </w:rPr>
         <w:drawing>
-          <wp:inline distT="0" distB="0" distL="0" distR="0" wp14:anchorId="3586C385" wp14:editId="0E079618">
+          <wp:inline distT="0" distB="0" distL="0" distR="0" wp14:anchorId="0D12A7CB" wp14:editId="1FBBC7FA">
             <wp:extent cx="5508000" cy="729885"/>
             <wp:effectExtent l="0" t="0" r="0" b="0"/>
             <wp:docPr id="1002" name="Cloud Photo figure 2" descr="Kết quả kiểm tra phiên bản Python và Git"/>
@@ -2984,7 +3224,7 @@
           <w:noProof/>
         </w:rPr>
         <w:drawing>
-          <wp:inline distT="0" distB="0" distL="0" distR="0" wp14:anchorId="5415C2DA" wp14:editId="61E0FE82">
+          <wp:inline distT="0" distB="0" distL="0" distR="0" wp14:anchorId="01F38243" wp14:editId="75D8FFE8">
             <wp:extent cx="5508000" cy="390425"/>
             <wp:effectExtent l="0" t="0" r="0" b="0"/>
             <wp:docPr id="1003" name="Cloud Photo figure 3" descr="Kết quả chạy bộ kiểm thử cục bộ"/>
@@ -3047,7 +3287,7 @@
         </w:rPr>
       </w:pPr>
       <w:bookmarkStart w:id="16" w:name="_Toc242620482"/>
-      <w:bookmarkStart w:id="17" w:name="_Toc242621039"/>
+      <w:bookmarkStart w:id="17" w:name="_Toc242920032"/>
       <w:r>
         <w:rPr>
           <w:szCs w:val="26"/>
@@ -3079,7 +3319,7 @@
         </w:rPr>
         <w:lastRenderedPageBreak/>
         <w:drawing>
-          <wp:inline distT="0" distB="0" distL="0" distR="0" wp14:anchorId="0F90AEDA" wp14:editId="3C908AB5">
+          <wp:inline distT="0" distB="0" distL="0" distR="0" wp14:anchorId="20DE50A3" wp14:editId="0BC8303F">
             <wp:extent cx="5508000" cy="2775349"/>
             <wp:effectExtent l="0" t="0" r="0" b="0"/>
             <wp:docPr id="1004" name="Cloud Photo figure 4" descr="Môi trường AWS Academy Learner Lab đã sẵn sàng"/>
@@ -3142,7 +3382,7 @@
         </w:rPr>
       </w:pPr>
       <w:bookmarkStart w:id="18" w:name="_Toc242620483"/>
-      <w:bookmarkStart w:id="19" w:name="_Toc242621040"/>
+      <w:bookmarkStart w:id="19" w:name="_Toc242920033"/>
       <w:r>
         <w:rPr>
           <w:szCs w:val="26"/>
@@ -3173,7 +3413,7 @@
           <w:noProof/>
         </w:rPr>
         <w:drawing>
-          <wp:inline distT="0" distB="0" distL="0" distR="0" wp14:anchorId="10260D5C" wp14:editId="1EDB4077">
+          <wp:inline distT="0" distB="0" distL="0" distR="0" wp14:anchorId="19EF88C0" wp14:editId="155DF981">
             <wp:extent cx="5508000" cy="2494732"/>
             <wp:effectExtent l="0" t="0" r="0" b="0"/>
             <wp:docPr id="1005" name="Cloud Photo figure 5" descr="Thông tin tổng quan của LabRole"/>
@@ -3249,7 +3489,7 @@
         </w:rPr>
         <w:lastRenderedPageBreak/>
         <w:drawing>
-          <wp:inline distT="0" distB="0" distL="0" distR="0" wp14:anchorId="5C44D7FD" wp14:editId="581EFF0B">
+          <wp:inline distT="0" distB="0" distL="0" distR="0" wp14:anchorId="513995D7" wp14:editId="293639FD">
             <wp:extent cx="5508000" cy="2620394"/>
             <wp:effectExtent l="0" t="0" r="0" b="0"/>
             <wp:docPr id="1006" name="Cloud Photo figure 6" descr="Chính sách tin cậy của LabRole có dịch vụ Lambda"/>
@@ -3309,7 +3549,7 @@
         <w:spacing w:before="0" w:after="0" w:line="360" w:lineRule="auto"/>
       </w:pPr>
       <w:bookmarkStart w:id="20" w:name="_Toc242620484"/>
-      <w:bookmarkStart w:id="21" w:name="_Toc242621041"/>
+      <w:bookmarkStart w:id="21" w:name="_Toc242920034"/>
       <w:r>
         <w:t>3.4. Tạo vùng lưu ảnh gốc và ảnh thu nhỏ</w:t>
       </w:r>
@@ -3337,7 +3577,7 @@
           <w:noProof/>
         </w:rPr>
         <w:drawing>
-          <wp:inline distT="0" distB="0" distL="0" distR="0" wp14:anchorId="382B25AF" wp14:editId="6A51787F">
+          <wp:inline distT="0" distB="0" distL="0" distR="0" wp14:anchorId="205B736E" wp14:editId="6F68189A">
             <wp:extent cx="5508000" cy="2629014"/>
             <wp:effectExtent l="0" t="0" r="0" b="0"/>
             <wp:docPr id="1007" name="Cloud Photo figure 7" descr="Bucket đầu vào đã có thư mục uploads/"/>
@@ -3413,7 +3653,7 @@
         </w:rPr>
         <w:lastRenderedPageBreak/>
         <w:drawing>
-          <wp:inline distT="0" distB="0" distL="0" distR="0" wp14:anchorId="52889CBE" wp14:editId="5DF2017C">
+          <wp:inline distT="0" distB="0" distL="0" distR="0" wp14:anchorId="0784BD64" wp14:editId="0A62591B">
             <wp:extent cx="5508000" cy="2617521"/>
             <wp:effectExtent l="0" t="0" r="0" b="0"/>
             <wp:docPr id="1008" name="Cloud Photo figure 8" descr="Bucket đầu ra đã được tạo để lưu thumbnail"/>
@@ -3473,7 +3713,7 @@
         <w:spacing w:before="0" w:after="0" w:line="360" w:lineRule="auto"/>
       </w:pPr>
       <w:bookmarkStart w:id="22" w:name="_Toc242620485"/>
-      <w:bookmarkStart w:id="23" w:name="_Toc242621042"/>
+      <w:bookmarkStart w:id="23" w:name="_Toc242920035"/>
       <w:r>
         <w:t>3.5. Cấu hình bảo vệ dữ liệu ảnh</w:t>
       </w:r>
@@ -3490,7 +3730,7 @@
         </w:rPr>
       </w:pPr>
       <w:bookmarkStart w:id="24" w:name="_Toc242620486"/>
-      <w:bookmarkStart w:id="25" w:name="_Toc242621043"/>
+      <w:bookmarkStart w:id="25" w:name="_Toc242920036"/>
       <w:r>
         <w:rPr>
           <w:sz w:val="26"/>
@@ -3522,7 +3762,7 @@
           <w:noProof/>
         </w:rPr>
         <w:drawing>
-          <wp:inline distT="0" distB="0" distL="0" distR="0" wp14:anchorId="282FD16F" wp14:editId="4D824B91">
+          <wp:inline distT="0" distB="0" distL="0" distR="0" wp14:anchorId="7A0127FD" wp14:editId="1968042E">
             <wp:extent cx="5508000" cy="2606028"/>
             <wp:effectExtent l="0" t="0" r="0" b="0"/>
             <wp:docPr id="1009" name="Cloud Photo figure 9" descr="Bucket đầu vào đã bật chặn truy cập công khai"/>
@@ -3598,7 +3838,7 @@
         </w:rPr>
         <w:lastRenderedPageBreak/>
         <w:drawing>
-          <wp:inline distT="0" distB="0" distL="0" distR="0" wp14:anchorId="1A99D504" wp14:editId="1A8DBE0B">
+          <wp:inline distT="0" distB="0" distL="0" distR="0" wp14:anchorId="46752882" wp14:editId="179FEE3A">
             <wp:extent cx="5508000" cy="2617521"/>
             <wp:effectExtent l="0" t="0" r="0" b="0"/>
             <wp:docPr id="1010" name="Cloud Photo figure 10" descr="Bucket đầu ra đã bật chặn truy cập công khai"/>
@@ -3658,7 +3898,7 @@
         <w:spacing w:before="0" w:after="0" w:line="360" w:lineRule="auto"/>
       </w:pPr>
       <w:bookmarkStart w:id="26" w:name="_Toc242620487"/>
-      <w:bookmarkStart w:id="27" w:name="_Toc242621044"/>
+      <w:bookmarkStart w:id="27" w:name="_Toc242920037"/>
       <w:r>
         <w:t>3.5.2. Quản lý quyền sở hữu đối tượng</w:t>
       </w:r>
@@ -3686,7 +3926,7 @@
           <w:noProof/>
         </w:rPr>
         <w:drawing>
-          <wp:inline distT="0" distB="0" distL="0" distR="0" wp14:anchorId="4AC05954" wp14:editId="502FC13C">
+          <wp:inline distT="0" distB="0" distL="0" distR="0" wp14:anchorId="6D82E93B" wp14:editId="523A652F">
             <wp:extent cx="5508000" cy="2606028"/>
             <wp:effectExtent l="0" t="0" r="0" b="0"/>
             <wp:docPr id="1011" name="Cloud Photo figure 11" descr="Cấu hình quyền sở hữu đối tượng của bucket đầu vào"/>
@@ -3762,7 +4002,7 @@
         </w:rPr>
         <w:lastRenderedPageBreak/>
         <w:drawing>
-          <wp:inline distT="0" distB="0" distL="0" distR="0" wp14:anchorId="5314ECD8" wp14:editId="64CEF056">
+          <wp:inline distT="0" distB="0" distL="0" distR="0" wp14:anchorId="25489384" wp14:editId="6C5007D1">
             <wp:extent cx="5508000" cy="2614648"/>
             <wp:effectExtent l="0" t="0" r="0" b="0"/>
             <wp:docPr id="1012" name="Cloud Photo figure 12" descr="Cấu hình quyền sở hữu đối tượng của bucket đầu ra"/>
@@ -3822,7 +4062,7 @@
         <w:spacing w:before="0" w:after="0" w:line="360" w:lineRule="auto"/>
       </w:pPr>
       <w:bookmarkStart w:id="28" w:name="_Toc242620488"/>
-      <w:bookmarkStart w:id="29" w:name="_Toc242621045"/>
+      <w:bookmarkStart w:id="29" w:name="_Toc242920038"/>
       <w:r>
         <w:t>3.5.3. Mã hóa và gắn nhãn tài nguyên</w:t>
       </w:r>
@@ -3850,7 +4090,7 @@
           <w:noProof/>
         </w:rPr>
         <w:drawing>
-          <wp:inline distT="0" distB="0" distL="0" distR="0" wp14:anchorId="71E6F339" wp14:editId="440DC5B2">
+          <wp:inline distT="0" distB="0" distL="0" distR="0" wp14:anchorId="5548C719" wp14:editId="640AF2C1">
             <wp:extent cx="5508000" cy="2606028"/>
             <wp:effectExtent l="0" t="0" r="0" b="0"/>
             <wp:docPr id="1013" name="Cloud Photo figure 13" descr="Mã hóa mặc định SSE-S3 của bucket đầu vào"/>
@@ -3926,7 +4166,7 @@
         </w:rPr>
         <w:lastRenderedPageBreak/>
         <w:drawing>
-          <wp:inline distT="0" distB="0" distL="0" distR="0" wp14:anchorId="5F661E65" wp14:editId="6BA8F5A3">
+          <wp:inline distT="0" distB="0" distL="0" distR="0" wp14:anchorId="130FCCCE" wp14:editId="6030A385">
             <wp:extent cx="5508000" cy="2608901"/>
             <wp:effectExtent l="0" t="0" r="0" b="0"/>
             <wp:docPr id="1014" name="Cloud Photo figure 14" descr="Nhãn quản lý và mã hóa của bucket đầu ra"/>
@@ -3986,7 +4226,7 @@
         <w:spacing w:before="0" w:after="0" w:line="360" w:lineRule="auto"/>
       </w:pPr>
       <w:bookmarkStart w:id="30" w:name="_Toc242620489"/>
-      <w:bookmarkStart w:id="31" w:name="_Toc242621046"/>
+      <w:bookmarkStart w:id="31" w:name="_Toc242920039"/>
       <w:r>
         <w:t>3.6. Tạo bảng lưu thông tin xử lý ảnh</w:t>
       </w:r>
@@ -4014,7 +4254,7 @@
           <w:noProof/>
         </w:rPr>
         <w:drawing>
-          <wp:inline distT="0" distB="0" distL="0" distR="0" wp14:anchorId="4BE44C19" wp14:editId="10484BDA">
+          <wp:inline distT="0" distB="0" distL="0" distR="0" wp14:anchorId="44FE175B" wp14:editId="62D2E96E">
             <wp:extent cx="5508000" cy="2606028"/>
             <wp:effectExtent l="0" t="0" r="0" b="0"/>
             <wp:docPr id="1015" name="Cloud Photo figure 15" descr="Bảng DynamoDB đã hoạt động với khóa image_id"/>
@@ -4090,7 +4330,7 @@
         </w:rPr>
         <w:lastRenderedPageBreak/>
         <w:drawing>
-          <wp:inline distT="0" distB="0" distL="0" distR="0" wp14:anchorId="4092ABD5" wp14:editId="55D6E8B6">
+          <wp:inline distT="0" distB="0" distL="0" distR="0" wp14:anchorId="505205F7" wp14:editId="75BBA8DF">
             <wp:extent cx="5508000" cy="2606028"/>
             <wp:effectExtent l="0" t="0" r="0" b="0"/>
             <wp:docPr id="1016" name="Cloud Photo figure 16" descr="Cấu hình mã hóa và nhãn quản lý của bảng DynamoDB"/>
@@ -4150,7 +4390,7 @@
         <w:spacing w:before="0" w:after="0" w:line="360" w:lineRule="auto"/>
       </w:pPr>
       <w:bookmarkStart w:id="32" w:name="_Toc242620490"/>
-      <w:bookmarkStart w:id="33" w:name="_Toc242621047"/>
+      <w:bookmarkStart w:id="33" w:name="_Toc242920040"/>
       <w:r>
         <w:t>3.7. Chuẩn bị thư viện tạo thumbnail</w:t>
       </w:r>
@@ -4178,7 +4418,7 @@
           <w:noProof/>
         </w:rPr>
         <w:drawing>
-          <wp:inline distT="0" distB="0" distL="0" distR="0" wp14:anchorId="30AA8242" wp14:editId="1853E649">
+          <wp:inline distT="0" distB="0" distL="0" distR="0" wp14:anchorId="3B4A728A" wp14:editId="3218F7F8">
             <wp:extent cx="5508000" cy="2606028"/>
             <wp:effectExtent l="0" t="0" r="0" b="0"/>
             <wp:docPr id="1017" name="Cloud Photo figure 17" descr="Pillow Layer phiên bản 1 dành cho Python 3.12 và x86_64"/>
@@ -4241,7 +4481,7 @@
         </w:rPr>
       </w:pPr>
       <w:bookmarkStart w:id="34" w:name="_Toc242620491"/>
-      <w:bookmarkStart w:id="35" w:name="_Toc242621048"/>
+      <w:bookmarkStart w:id="35" w:name="_Toc242920041"/>
       <w:r>
         <w:rPr>
           <w:szCs w:val="26"/>
@@ -4276,7 +4516,7 @@
           <w:noProof/>
         </w:rPr>
         <w:drawing>
-          <wp:inline distT="0" distB="0" distL="0" distR="0" wp14:anchorId="65B63CDC" wp14:editId="1B49A28F">
+          <wp:inline distT="0" distB="0" distL="0" distR="0" wp14:anchorId="02EDA4C9" wp14:editId="71D775A1">
             <wp:extent cx="5508000" cy="2620394"/>
             <wp:effectExtent l="0" t="0" r="0" b="0"/>
             <wp:docPr id="1018" name="Cloud Photo figure 18" descr="Ngân sách Learner Lab sau khi thiết lập tài nguyên"/>
@@ -4342,7 +4582,7 @@
         </w:rPr>
       </w:pPr>
       <w:bookmarkStart w:id="36" w:name="_Toc242620492"/>
-      <w:bookmarkStart w:id="37" w:name="_Toc242621049"/>
+      <w:bookmarkStart w:id="37" w:name="_Toc242920042"/>
       <w:r>
         <w:rPr>
           <w:sz w:val="26"/>
@@ -4363,7 +4603,7 @@
         </w:rPr>
       </w:pPr>
       <w:bookmarkStart w:id="38" w:name="_Toc242620493"/>
-      <w:bookmarkStart w:id="39" w:name="_Toc242621050"/>
+      <w:bookmarkStart w:id="39" w:name="_Toc242920043"/>
       <w:r>
         <w:rPr>
           <w:szCs w:val="26"/>
@@ -4998,7 +5238,7 @@
         <w:spacing w:before="0" w:after="0" w:line="360" w:lineRule="auto"/>
       </w:pPr>
       <w:bookmarkStart w:id="40" w:name="_Toc242620494"/>
-      <w:bookmarkStart w:id="41" w:name="_Toc242621051"/>
+      <w:bookmarkStart w:id="41" w:name="_Toc242920044"/>
       <w:r>
         <w:t>4.2. Kết quả đạt được</w:t>
       </w:r>
@@ -5496,7 +5736,7 @@
         </w:rPr>
       </w:pPr>
       <w:bookmarkStart w:id="42" w:name="_Toc242620495"/>
-      <w:bookmarkStart w:id="43" w:name="_Toc242621052"/>
+      <w:bookmarkStart w:id="43" w:name="_Toc242920045"/>
       <w:r>
         <w:rPr>
           <w:szCs w:val="26"/>
@@ -5539,17 +5779,971 @@
     </w:p>
     <w:p>
       <w:pPr>
+        <w:pStyle w:val="Heading2"/>
+      </w:pPr>
+      <w:bookmarkStart w:id="44" w:name="_Toc242920046"/>
+      <w:r>
+        <w:lastRenderedPageBreak/>
+        <w:t>4.4. Khai báo sử dụng AI và minh chứng hoàn thiện</w:t>
+      </w:r>
+      <w:bookmarkEnd w:id="44"/>
+    </w:p>
+    <w:p>
+      <w:pPr>
+        <w:spacing w:after="120" w:line="360" w:lineRule="auto"/>
+        <w:jc w:val="both"/>
+      </w:pPr>
+      <w:r>
+        <w:rPr>
+          <w:sz w:val="26"/>
+        </w:rPr>
+        <w:t>Nhóm sử dụng ChatGPT Sol 6.1 hỗ</w:t>
+      </w:r>
+      <w:r>
+        <w:rPr>
+          <w:sz w:val="26"/>
+        </w:rPr>
+        <w:t xml:space="preserve"> trợ chủ yếu phần mã nguồn và hướng dẫn cấu hình; sinh viên trực tiếp thực hiện cấu hình trên máy và AWS Academy. Google Gemini hỗ trợ tóm lược/rà soát commit, hướng dẫn push GitHub và trình bày Markdown. Bản khai báo bổ sung ghi rõ hai phạm vi này cùng ph</w:t>
+      </w:r>
+      <w:r>
+        <w:rPr>
+          <w:sz w:val="26"/>
+        </w:rPr>
+        <w:t>ần nhóm hoàn thiện và link commit đối chiếu.</w:t>
+      </w:r>
+    </w:p>
+    <w:p>
+      <w:pPr>
+        <w:spacing w:after="120" w:line="360" w:lineRule="auto"/>
+        <w:jc w:val="both"/>
+      </w:pPr>
+      <w:r>
+        <w:rPr>
+          <w:sz w:val="26"/>
+        </w:rPr>
+        <w:t>Thông tin công cụ được cập nhật theo xác nhận của nhóm ngày 15/10/2026. Các prompt dưới đây là bản tóm lược yêu cầu đã trao đổi, không giả định là bản chép nguyên văn hội thoại. Model ChatGPT ghi Sol 6.1 theo xá</w:t>
+      </w:r>
+      <w:r>
+        <w:rPr>
+          <w:sz w:val="26"/>
+        </w:rPr>
+        <w:t>c nhận của nhóm; phiên bản Gemini không được suy đoán khi chưa ghi nhận chính xác.</w:t>
+      </w:r>
+    </w:p>
+    <w:p>
+      <w:pPr>
+        <w:pStyle w:val="Heading3"/>
+      </w:pPr>
+      <w:bookmarkStart w:id="45" w:name="_Toc242920047"/>
+      <w:r>
+        <w:t>4.4.1. ChatGPT — Hỗ trợ mã nguồn, hướng dẫn cấu hình và rà soát báo cáo</w:t>
+      </w:r>
+      <w:bookmarkEnd w:id="45"/>
+    </w:p>
+    <w:p>
+      <w:pPr>
+        <w:spacing w:after="120" w:line="360" w:lineRule="auto"/>
+        <w:jc w:val="both"/>
+      </w:pPr>
+      <w:r>
+        <w:rPr>
+          <w:sz w:val="26"/>
+        </w:rPr>
+        <w:t>Công cụ AI: ChatGPT. Phiên bản/model: Sol 6.1 (theo xác nhận của nhóm).</w:t>
+      </w:r>
+    </w:p>
+    <w:p>
+      <w:pPr>
+        <w:spacing w:after="120" w:line="360" w:lineRule="auto"/>
+        <w:jc w:val="both"/>
+      </w:pPr>
+      <w:r>
+        <w:rPr>
+          <w:sz w:val="26"/>
+        </w:rPr>
+        <w:t>Prompt đã dùng (tóm lược theo</w:t>
+      </w:r>
+      <w:r>
+        <w:rPr>
+          <w:sz w:val="26"/>
+        </w:rPr>
+        <w:t xml:space="preserve"> xác nhận của nhóm): Hướng dẫn xây dựng hệ thống tạo thumbnail trên AWS bằng S3, Lambda, DynamoDB và Pillow; hỗ trợ mã nguồn xử lý ảnh, web và kiểm thử, hướng dẫn cấu hình từng bước để nhóm thực hiện trên máy và AWS Academy.</w:t>
+      </w:r>
+    </w:p>
+    <w:p>
+      <w:pPr>
+        <w:spacing w:after="120" w:line="360" w:lineRule="auto"/>
+        <w:jc w:val="both"/>
+      </w:pPr>
+      <w:r>
+        <w:rPr>
+          <w:sz w:val="26"/>
+        </w:rPr>
+        <w:t>Nội dung AI tạo ra/hỗ trợ: Hướn</w:t>
+      </w:r>
+      <w:r>
+        <w:rPr>
+          <w:sz w:val="26"/>
+        </w:rPr>
+        <w:t>g dẫn kiến trúc và cấu hình, đề xuất/soạn mã Python xử lý ảnh, Lambda worker, giao diện Flask và các thành phần kiểm thử; hỗ trợ tổ chức tài liệu và rà soát hồ sơ nộp lại. Đây là công cụ hỗ trợ phần code và hướng dẫn cấu hình chủ yếu theo xác nhận của nhóm</w:t>
+      </w:r>
+      <w:r>
+        <w:rPr>
+          <w:sz w:val="26"/>
+        </w:rPr>
+        <w:t>.</w:t>
+      </w:r>
+    </w:p>
+    <w:p>
+      <w:pPr>
+        <w:spacing w:after="120" w:line="360" w:lineRule="auto"/>
+        <w:jc w:val="both"/>
+      </w:pPr>
+      <w:r>
+        <w:rPr>
+          <w:sz w:val="26"/>
+        </w:rPr>
+        <w:t>Phần sinh viên đã sửa/hoàn thiện:</w:t>
+      </w:r>
+    </w:p>
+    <w:p>
+      <w:pPr>
+        <w:spacing w:after="120" w:line="360" w:lineRule="auto"/>
+        <w:jc w:val="both"/>
+      </w:pPr>
+      <w:r>
+        <w:rPr>
+          <w:sz w:val="26"/>
+        </w:rPr>
+        <w:t>Bùi Nguyễn Duy Trung: Trực tiếp thực hiện các bước cấu hình trên máy và AWS Academy: Python/Git, hai bucket S3, bảo mật bucket, LabRole, DynamoDB và Pillow Layer. Khôi phục 24 ảnh gốc cùng danh mục; 17 ảnh khớp SHA-256 v</w:t>
+      </w:r>
+      <w:r>
+        <w:rPr>
+          <w:sz w:val="26"/>
+        </w:rPr>
+        <w:t>ới ảnh trong Word. Commit này ghi nhận việc khôi phục minh chứng, không phải ngày tạo tài nguyên.</w:t>
+      </w:r>
+    </w:p>
+    <w:p>
+      <w:pPr>
+        <w:spacing w:after="120" w:line="360" w:lineRule="auto"/>
+        <w:jc w:val="both"/>
+      </w:pPr>
+      <w:r>
+        <w:rPr>
+          <w:sz w:val="26"/>
+        </w:rPr>
+        <w:t xml:space="preserve">Minh chứng: </w:t>
+      </w:r>
+      <w:hyperlink r:id="rId29">
+        <w:r>
+          <w:rPr>
+            <w:color w:val="0563C1"/>
+            <w:sz w:val="26"/>
+            <w:u w:val="single"/>
+          </w:rPr>
+          <w:t>Commit 10b9d98</w:t>
+        </w:r>
+      </w:hyperlink>
+      <w:r>
+        <w:t xml:space="preserve"> — </w:t>
+      </w:r>
+      <w:hyperlink r:id="rId30">
+        <w:r>
+          <w:rPr>
+            <w:color w:val="0563C1"/>
+            <w:sz w:val="26"/>
+            <w:u w:val="single"/>
+          </w:rPr>
+          <w:t>evidence/tuan-1/README.md</w:t>
+        </w:r>
+      </w:hyperlink>
+    </w:p>
+    <w:p>
+      <w:pPr>
+        <w:spacing w:after="120" w:line="360" w:lineRule="auto"/>
+        <w:jc w:val="both"/>
+      </w:pPr>
+      <w:r>
+        <w:rPr>
+          <w:sz w:val="26"/>
+        </w:rPr>
+        <w:t xml:space="preserve">Bùi Nguyễn Duy Trung: Đối chiếu tên tài nguyên và thông số thật: </w:t>
+      </w:r>
+      <w:r>
+        <w:rPr>
+          <w:sz w:val="26"/>
+        </w:rPr>
+        <w:t xml:space="preserve">cloudphoto-input-103308504802, cloudphoto-output-103308504802, bảng cloud-photo-metadata chỉ </w:t>
+      </w:r>
+      <w:r>
+        <w:rPr>
+          <w:sz w:val="26"/>
+        </w:rPr>
+        <w:lastRenderedPageBreak/>
+        <w:t>có khóa image_id; Python 3.12 và x86_64 của layer. Ghi lại cấu hình và chuẩn bị script đóng gói.</w:t>
+      </w:r>
+    </w:p>
+    <w:p>
+      <w:pPr>
+        <w:spacing w:after="120" w:line="360" w:lineRule="auto"/>
+        <w:jc w:val="both"/>
+      </w:pPr>
+      <w:r>
+        <w:rPr>
+          <w:sz w:val="26"/>
+        </w:rPr>
+        <w:t xml:space="preserve">Minh chứng: </w:t>
+      </w:r>
+      <w:hyperlink r:id="rId31">
+        <w:r>
+          <w:rPr>
+            <w:color w:val="0563C1"/>
+            <w:sz w:val="26"/>
+            <w:u w:val="single"/>
+          </w:rPr>
+          <w:t>Commit 213b093</w:t>
+        </w:r>
+      </w:hyperlink>
+      <w:r>
+        <w:t xml:space="preserve"> — </w:t>
+      </w:r>
+      <w:hyperlink r:id="rId32" w:anchor="L4-L31">
+        <w:r>
+          <w:rPr>
+            <w:color w:val="0563C1"/>
+            <w:sz w:val="26"/>
+            <w:u w:val="single"/>
+          </w:rPr>
+          <w:t>config/aws-resources.json</w:t>
+        </w:r>
+      </w:hyperlink>
+    </w:p>
+    <w:p>
+      <w:pPr>
+        <w:spacing w:after="120" w:line="360" w:lineRule="auto"/>
+        <w:jc w:val="both"/>
+      </w:pPr>
+      <w:r>
+        <w:rPr>
+          <w:sz w:val="26"/>
+        </w:rPr>
+        <w:t>Bùi Nguyễn Du</w:t>
+      </w:r>
+      <w:r>
+        <w:rPr>
+          <w:sz w:val="26"/>
+        </w:rPr>
+        <w:t xml:space="preserve">y Trung: Áp dụng và hoàn thiện mã Pillow theo yêu cầu dự án: JPEG/PNG tĩnh, giới hạn 10 MiB/24 triệu pixel, cạnh dài tối đa 150/400/1000 px, giữ tỷ lệ, ghép nền trắng cho ảnh trong suốt, watermark CLOUD PHOTO và loại EXIF. Mã có AI hỗ trợ; commit được dẫn </w:t>
+      </w:r>
+      <w:r>
+        <w:rPr>
+          <w:sz w:val="26"/>
+        </w:rPr>
+        <w:t>để đối chiếu phiên bản hoàn thiện.</w:t>
+      </w:r>
+    </w:p>
+    <w:p>
+      <w:pPr>
+        <w:spacing w:after="120" w:line="360" w:lineRule="auto"/>
+        <w:jc w:val="both"/>
+      </w:pPr>
+      <w:r>
+        <w:rPr>
+          <w:sz w:val="26"/>
+        </w:rPr>
+        <w:t xml:space="preserve">Minh chứng: </w:t>
+      </w:r>
+      <w:hyperlink r:id="rId33">
+        <w:r>
+          <w:rPr>
+            <w:color w:val="0563C1"/>
+            <w:sz w:val="26"/>
+            <w:u w:val="single"/>
+          </w:rPr>
+          <w:t>Commit 1c41d75</w:t>
+        </w:r>
+      </w:hyperlink>
+      <w:r>
+        <w:t xml:space="preserve"> — </w:t>
+      </w:r>
+      <w:hyperlink r:id="rId34" w:anchor="L7-L75">
+        <w:r>
+          <w:rPr>
+            <w:color w:val="0563C1"/>
+            <w:sz w:val="26"/>
+            <w:u w:val="single"/>
+          </w:rPr>
+          <w:t>src/processor/image_tools.py</w:t>
+        </w:r>
+      </w:hyperlink>
+    </w:p>
+    <w:p>
+      <w:pPr>
+        <w:spacing w:after="120" w:line="360" w:lineRule="auto"/>
+        <w:jc w:val="both"/>
+      </w:pPr>
+      <w:r>
+        <w:rPr>
+          <w:sz w:val="26"/>
+        </w:rPr>
+        <w:t>Bùi Nguyễn Duy Trung: Hoàn thiện worker với cấu hình bucket/prefix, ba ảnh đầu ra và metadata trạng thái; kiểm tra các nhánh sự kiện trùng/lỗi qua kiểm thử giả lậ</w:t>
+      </w:r>
+      <w:r>
+        <w:rPr>
+          <w:sz w:val="26"/>
+        </w:rPr>
+        <w:t>p. Chưa khai báo đã tích hợp đầy đủ Lambda trên AWS trong tuần 1.</w:t>
+      </w:r>
+    </w:p>
+    <w:p>
+      <w:pPr>
+        <w:spacing w:after="120" w:line="360" w:lineRule="auto"/>
+        <w:jc w:val="both"/>
+      </w:pPr>
+      <w:r>
+        <w:rPr>
+          <w:sz w:val="26"/>
+        </w:rPr>
+        <w:t xml:space="preserve">Minh chứng: </w:t>
+      </w:r>
+      <w:hyperlink r:id="rId35">
+        <w:r>
+          <w:rPr>
+            <w:color w:val="0563C1"/>
+            <w:sz w:val="26"/>
+            <w:u w:val="single"/>
+          </w:rPr>
+          <w:t>Commit e50cb0c</w:t>
+        </w:r>
+      </w:hyperlink>
+      <w:r>
+        <w:t xml:space="preserve"> — </w:t>
+      </w:r>
+      <w:hyperlink r:id="rId36" w:anchor="L30-L167">
+        <w:r>
+          <w:rPr>
+            <w:color w:val="0563C1"/>
+            <w:sz w:val="26"/>
+            <w:u w:val="single"/>
+          </w:rPr>
+          <w:t>src/processor/lambda_function.py</w:t>
+        </w:r>
+      </w:hyperlink>
+    </w:p>
+    <w:p>
+      <w:pPr>
+        <w:spacing w:after="120" w:line="360" w:lineRule="auto"/>
+        <w:jc w:val="both"/>
+      </w:pPr>
+      <w:r>
+        <w:rPr>
+          <w:sz w:val="26"/>
+        </w:rPr>
+        <w:t>Đỗ Anh Tuấn: Theo phân công trong repo, hoàn thiện phần Flask có AI hỗ trợ: đăng nhập, CSRF, tải ảnh bằng tên khóa duy nh</w:t>
+      </w:r>
+      <w:r>
+        <w:rPr>
+          <w:sz w:val="26"/>
+        </w:rPr>
+        <w:t>ất, gallery và header bảo mật; đối chiếu bằng kiểm thử web.</w:t>
+      </w:r>
+    </w:p>
+    <w:p>
+      <w:pPr>
+        <w:spacing w:after="120" w:line="360" w:lineRule="auto"/>
+        <w:jc w:val="both"/>
+      </w:pPr>
+      <w:r>
+        <w:rPr>
+          <w:sz w:val="26"/>
+        </w:rPr>
+        <w:t xml:space="preserve">Minh chứng: </w:t>
+      </w:r>
+      <w:hyperlink r:id="rId37">
+        <w:r>
+          <w:rPr>
+            <w:color w:val="0563C1"/>
+            <w:sz w:val="26"/>
+            <w:u w:val="single"/>
+          </w:rPr>
+          <w:t>Commit 9b0aca9</w:t>
+        </w:r>
+      </w:hyperlink>
+      <w:r>
+        <w:t xml:space="preserve"> — </w:t>
+      </w:r>
+      <w:hyperlink r:id="rId38" w:anchor="L100-L229">
+        <w:r>
+          <w:rPr>
+            <w:color w:val="0563C1"/>
+            <w:sz w:val="26"/>
+            <w:u w:val="single"/>
+          </w:rPr>
+          <w:t>src/web/app.py</w:t>
+        </w:r>
+      </w:hyperlink>
+    </w:p>
+    <w:p>
+      <w:pPr>
+        <w:spacing w:after="120" w:line="360" w:lineRule="auto"/>
+        <w:jc w:val="both"/>
+      </w:pPr>
+      <w:r>
+        <w:rPr>
+          <w:sz w:val="26"/>
+        </w:rPr>
+        <w:t>Đỗ Anh Tuấn: Hoàn thiện 10 ca ảnh: bốn hình dạng, RGBA, ba đầu vào không hợp lệ, GIF và EXIF; kiểm tra các kích thước và tỷ lệ đầu ra.</w:t>
+      </w:r>
+    </w:p>
+    <w:p>
+      <w:pPr>
+        <w:spacing w:after="120" w:line="360" w:lineRule="auto"/>
+        <w:jc w:val="both"/>
+      </w:pPr>
+      <w:r>
+        <w:rPr>
+          <w:sz w:val="26"/>
+        </w:rPr>
+        <w:t xml:space="preserve">Minh chứng: </w:t>
+      </w:r>
+      <w:hyperlink r:id="rId39">
+        <w:r>
+          <w:rPr>
+            <w:color w:val="0563C1"/>
+            <w:sz w:val="26"/>
+            <w:u w:val="single"/>
+          </w:rPr>
+          <w:t>Commit 30838ce</w:t>
+        </w:r>
+      </w:hyperlink>
+      <w:r>
+        <w:t xml:space="preserve"> — </w:t>
+      </w:r>
+      <w:hyperlink r:id="rId40" w:anchor="L17-L60">
+        <w:r>
+          <w:rPr>
+            <w:color w:val="0563C1"/>
+            <w:sz w:val="26"/>
+            <w:u w:val="single"/>
+          </w:rPr>
+          <w:t>test</w:t>
+        </w:r>
+        <w:r>
+          <w:rPr>
+            <w:color w:val="0563C1"/>
+            <w:sz w:val="26"/>
+            <w:u w:val="single"/>
+          </w:rPr>
+          <w:t>s/test_images.py</w:t>
+        </w:r>
+      </w:hyperlink>
+    </w:p>
+    <w:p>
+      <w:pPr>
+        <w:spacing w:after="120" w:line="360" w:lineRule="auto"/>
+        <w:jc w:val="both"/>
+      </w:pPr>
+      <w:r>
+        <w:rPr>
+          <w:sz w:val="26"/>
+        </w:rPr>
+        <w:t>Đỗ Anh Tuấn: Hoàn thiện năm ca worker dùng mock S3/DynamoDB và bốn ca Flask; cấu hình kiểm thử tự động. Log CI của bản f92ab84 ghi nhận 19/19 ca đạt, không phải kiểm thử AWS tích hợp.</w:t>
+      </w:r>
+    </w:p>
+    <w:p>
+      <w:pPr>
+        <w:spacing w:after="120" w:line="360" w:lineRule="auto"/>
+        <w:jc w:val="both"/>
+      </w:pPr>
+      <w:r>
+        <w:rPr>
+          <w:sz w:val="26"/>
+        </w:rPr>
+        <w:t xml:space="preserve">Minh chứng: </w:t>
+      </w:r>
+      <w:hyperlink r:id="rId41">
+        <w:r>
+          <w:rPr>
+            <w:color w:val="0563C1"/>
+            <w:sz w:val="26"/>
+            <w:u w:val="single"/>
+          </w:rPr>
+          <w:t>Commit f3e62ba</w:t>
+        </w:r>
+      </w:hyperlink>
+      <w:r>
+        <w:t xml:space="preserve"> — </w:t>
+      </w:r>
+      <w:hyperlink r:id="rId42" w:anchor="L59-L133">
+        <w:r>
+          <w:rPr>
+            <w:color w:val="0563C1"/>
+            <w:sz w:val="26"/>
+            <w:u w:val="single"/>
+          </w:rPr>
+          <w:t>tests/test_worker.py</w:t>
+        </w:r>
+      </w:hyperlink>
+    </w:p>
+    <w:p>
+      <w:pPr>
+        <w:pStyle w:val="Heading3"/>
+      </w:pPr>
+      <w:bookmarkStart w:id="46" w:name="_Toc242920048"/>
+      <w:r>
+        <w:t>4.4.2. Google Gemini — Tóm lược, rà soát commit và hướng dẫn trình bày Markdown</w:t>
+      </w:r>
+      <w:bookmarkEnd w:id="46"/>
+    </w:p>
+    <w:p>
+      <w:pPr>
+        <w:spacing w:after="120" w:line="360" w:lineRule="auto"/>
+        <w:jc w:val="both"/>
+      </w:pPr>
+      <w:r>
+        <w:rPr>
+          <w:sz w:val="26"/>
+        </w:rPr>
+        <w:t>Công cụ AI: Google Gemini. Phiên bản/model: Không ghi nhận chính xác phiên bản/model.</w:t>
+      </w:r>
+    </w:p>
+    <w:p>
+      <w:pPr>
+        <w:spacing w:after="120" w:line="360" w:lineRule="auto"/>
+        <w:jc w:val="both"/>
+      </w:pPr>
+      <w:r>
+        <w:rPr>
+          <w:sz w:val="26"/>
+        </w:rPr>
+        <w:lastRenderedPageBreak/>
+        <w:t>Prompt đã dùng (tóm lược theo xác nhận của nhóm): Xem và tó</w:t>
+      </w:r>
+      <w:r>
+        <w:rPr>
+          <w:sz w:val="26"/>
+        </w:rPr>
+        <w:t>m lược lịch sử commit của dự án, kiểm tra commit/phân công đã phù hợp chưa, hướng dẫn push lên GitHub và cách viết file Markdown trình bày nội dung nộp tuần 1.</w:t>
+      </w:r>
+    </w:p>
+    <w:p>
+      <w:pPr>
+        <w:spacing w:after="120" w:line="360" w:lineRule="auto"/>
+        <w:jc w:val="both"/>
+      </w:pPr>
+      <w:r>
+        <w:rPr>
+          <w:sz w:val="26"/>
+        </w:rPr>
+        <w:t>Nội dung AI tạo ra/hỗ trợ: Gợi ý cách rà soát và tóm lược commit, hướng dẫn thao tác push GitHub</w:t>
+      </w:r>
+      <w:r>
+        <w:rPr>
+          <w:sz w:val="26"/>
+        </w:rPr>
+        <w:t xml:space="preserve"> và bố cục Markdown cho báo cáo. Không kê khai Gemini là công cụ chủ yếu sinh code hoặc viết các bài kiểm thử.</w:t>
+      </w:r>
+    </w:p>
+    <w:p>
+      <w:pPr>
+        <w:spacing w:after="120" w:line="360" w:lineRule="auto"/>
+        <w:jc w:val="both"/>
+      </w:pPr>
+      <w:r>
+        <w:rPr>
+          <w:sz w:val="26"/>
+        </w:rPr>
+        <w:t>Phần sinh viên đã sửa/hoàn thiện:</w:t>
+      </w:r>
+    </w:p>
+    <w:p>
+      <w:pPr>
+        <w:spacing w:after="120" w:line="360" w:lineRule="auto"/>
+        <w:jc w:val="both"/>
+      </w:pPr>
+      <w:r>
+        <w:rPr>
+          <w:sz w:val="26"/>
+        </w:rPr>
+        <w:t xml:space="preserve">Nhóm sinh viên: Đối chiếu từng link commit với tệp thật và trách nhiệm thành viên; giữ 13 commit mã nguồn </w:t>
+      </w:r>
+      <w:r>
+        <w:rPr>
+          <w:sz w:val="26"/>
+        </w:rPr>
+        <w:t>tuần 1 làm mốc, bổ sung riêng commit khôi phục ảnh. Các commit mới ghi đúng thời điểm khôi phục/biên tập, không sửa lịch sử cũ.</w:t>
+      </w:r>
+    </w:p>
+    <w:p>
+      <w:pPr>
+        <w:spacing w:after="120" w:line="360" w:lineRule="auto"/>
+        <w:jc w:val="both"/>
+      </w:pPr>
+      <w:r>
+        <w:rPr>
+          <w:sz w:val="26"/>
+        </w:rPr>
+        <w:t xml:space="preserve">Minh chứng: </w:t>
+      </w:r>
+      <w:hyperlink r:id="rId43">
+        <w:r>
+          <w:rPr>
+            <w:color w:val="0563C1"/>
+            <w:sz w:val="26"/>
+            <w:u w:val="single"/>
+          </w:rPr>
+          <w:t xml:space="preserve">Commit </w:t>
+        </w:r>
+        <w:r>
+          <w:rPr>
+            <w:color w:val="0563C1"/>
+            <w:sz w:val="26"/>
+            <w:u w:val="single"/>
+          </w:rPr>
+          <w:t>10b9d98</w:t>
+        </w:r>
+      </w:hyperlink>
+      <w:r>
+        <w:t xml:space="preserve"> — </w:t>
+      </w:r>
+      <w:hyperlink r:id="rId44">
+        <w:r>
+          <w:rPr>
+            <w:color w:val="0563C1"/>
+            <w:sz w:val="26"/>
+            <w:u w:val="single"/>
+          </w:rPr>
+          <w:t>evidence/tuan-1/DOI_CHIEU_ANH.json</w:t>
+        </w:r>
+      </w:hyperlink>
+    </w:p>
+    <w:p>
+      <w:pPr>
+        <w:spacing w:after="120" w:line="360" w:lineRule="auto"/>
+        <w:jc w:val="both"/>
+      </w:pPr>
+      <w:r>
+        <w:rPr>
+          <w:sz w:val="26"/>
+        </w:rPr>
+        <w:t xml:space="preserve">Nhóm sinh viên: Thống nhất lại phạm vi sử dụng AI theo xác nhận thực </w:t>
+      </w:r>
+      <w:r>
+        <w:rPr>
+          <w:sz w:val="26"/>
+        </w:rPr>
+        <w:t>tế; trình bày phần hỗ trợ, phần hoàn thiện và link minh chứng trong Markdown. Bản bổ sung có ChatGPT hỗ trợ rà soát và biên tập; nhóm kiểm tra lại thông tin trước khi nộp.</w:t>
+      </w:r>
+    </w:p>
+    <w:p>
+      <w:pPr>
+        <w:spacing w:after="120" w:line="360" w:lineRule="auto"/>
+        <w:jc w:val="both"/>
+      </w:pPr>
+      <w:r>
+        <w:rPr>
+          <w:sz w:val="26"/>
+        </w:rPr>
+        <w:t xml:space="preserve">Minh chứng: </w:t>
+      </w:r>
+      <w:hyperlink r:id="rId45">
+        <w:r>
+          <w:rPr>
+            <w:color w:val="0563C1"/>
+            <w:sz w:val="26"/>
+            <w:u w:val="single"/>
+          </w:rPr>
+          <w:t>Commit 27b1e83</w:t>
+        </w:r>
+      </w:hyperlink>
+      <w:r>
+        <w:t xml:space="preserve"> — </w:t>
+      </w:r>
+      <w:hyperlink r:id="rId46">
+        <w:r>
+          <w:rPr>
+            <w:color w:val="0563C1"/>
+            <w:sz w:val="26"/>
+            <w:u w:val="single"/>
+          </w:rPr>
+          <w:t>AI_DISCLOSURE.md</w:t>
+        </w:r>
+      </w:hyperlink>
+    </w:p>
+    <w:p>
+      <w:pPr>
+        <w:pStyle w:val="Heading3"/>
+      </w:pPr>
+      <w:bookmarkStart w:id="47" w:name="_Toc242920049"/>
+      <w:r>
+        <w:t>4.4.3. Danh mục ảnh cấu hình và phạm vi minh chứng</w:t>
+      </w:r>
+      <w:bookmarkEnd w:id="47"/>
+    </w:p>
+    <w:p>
+      <w:pPr>
+        <w:spacing w:after="120" w:line="360" w:lineRule="auto"/>
+        <w:jc w:val="both"/>
+      </w:pPr>
+      <w:r>
+        <w:rPr>
+          <w:sz w:val="26"/>
+        </w:rPr>
+        <w:t xml:space="preserve">Nhóm khôi </w:t>
+      </w:r>
+      <w:r>
+        <w:rPr>
+          <w:sz w:val="26"/>
+        </w:rPr>
+        <w:t>phục 24 ảnh gốc và danh mục từ bản lưu cục bộ. Đối chiếu SHA-256 xác nhận 17 ảnh trùng với ảnh minh chứng trong báo cáo; các ảnh bổ trợ được giữ và ghi rõ trong danh mục. Không tạo ảnh AWS bằng AI, không tự bổ sung ngày chụp hoặc người chụp chưa được xác n</w:t>
+      </w:r>
+      <w:r>
+        <w:rPr>
+          <w:sz w:val="26"/>
+        </w:rPr>
+        <w:t>hận.</w:t>
+      </w:r>
+    </w:p>
+    <w:p>
+      <w:pPr>
+        <w:spacing w:after="120" w:line="360" w:lineRule="auto"/>
+        <w:jc w:val="both"/>
+      </w:pPr>
+      <w:r>
+        <w:rPr>
+          <w:sz w:val="26"/>
+        </w:rPr>
+        <w:t xml:space="preserve">Danh mục ảnh: </w:t>
+      </w:r>
+      <w:hyperlink r:id="rId47">
+        <w:r>
+          <w:rPr>
+            <w:color w:val="0563C1"/>
+            <w:sz w:val="26"/>
+            <w:u w:val="single"/>
+          </w:rPr>
+          <w:t>24 ảnh gốc và vị trí báo cáo</w:t>
+        </w:r>
+      </w:hyperlink>
+      <w:r>
+        <w:t xml:space="preserve"> — </w:t>
+      </w:r>
+      <w:hyperlink r:id="rId48">
+        <w:r>
+          <w:rPr>
+            <w:color w:val="0563C1"/>
+            <w:sz w:val="26"/>
+            <w:u w:val="single"/>
+          </w:rPr>
+          <w:t>Danh mục CSV</w:t>
+        </w:r>
+      </w:hyperlink>
+    </w:p>
+    <w:p>
+      <w:pPr>
+        <w:spacing w:after="120" w:line="360" w:lineRule="auto"/>
+        <w:jc w:val="both"/>
+      </w:pPr>
+      <w:r>
+        <w:rPr>
+          <w:sz w:val="26"/>
+        </w:rPr>
+        <w:t xml:space="preserve">Commit khôi phục minh chứng: </w:t>
+      </w:r>
+      <w:hyperlink r:id="rId49">
+        <w:r>
+          <w:rPr>
+            <w:color w:val="0563C1"/>
+            <w:sz w:val="26"/>
+            <w:u w:val="single"/>
+          </w:rPr>
+          <w:t>10b9d98</w:t>
+        </w:r>
+      </w:hyperlink>
+    </w:p>
+    <w:p>
+      <w:pPr>
+        <w:spacing w:after="120" w:line="360" w:lineRule="auto"/>
+        <w:jc w:val="both"/>
+      </w:pPr>
+      <w:r>
+        <w:rPr>
+          <w:sz w:val="26"/>
+        </w:rPr>
+        <w:t>Commit xác nhận phạm vi</w:t>
+      </w:r>
+      <w:r>
+        <w:rPr>
+          <w:sz w:val="26"/>
+        </w:rPr>
+        <w:t xml:space="preserve"> AI và trình bày Markdown: </w:t>
+      </w:r>
+      <w:hyperlink r:id="rId50">
+        <w:r>
+          <w:rPr>
+            <w:color w:val="0563C1"/>
+            <w:sz w:val="26"/>
+            <w:u w:val="single"/>
+          </w:rPr>
+          <w:t>27b1e83</w:t>
+        </w:r>
+      </w:hyperlink>
+    </w:p>
+    <w:p>
+      <w:pPr>
+        <w:spacing w:after="120" w:line="360" w:lineRule="auto"/>
+        <w:jc w:val="both"/>
+      </w:pPr>
+      <w:r>
+        <w:rPr>
+          <w:sz w:val="26"/>
+        </w:rPr>
+        <w:t xml:space="preserve">Ngày commit khôi phục chỉ ghi nhận việc đưa các ảnh có sẵn trở lại repo, không phải ngày cấu hình AWS hoặc ngày </w:t>
+      </w:r>
+      <w:r>
+        <w:rPr>
+          <w:sz w:val="26"/>
+        </w:rPr>
+        <w:t>chụp. Những ảnh bucket output và bảng DynamoDB chưa có dữ liệu phản ánh trạng thái chuẩn bị tài nguyên tuần 1.</w:t>
+      </w:r>
+    </w:p>
+    <w:p>
+      <w:pPr>
+        <w:spacing w:after="120" w:line="360" w:lineRule="auto"/>
+        <w:jc w:val="both"/>
+      </w:pPr>
+      <w:r>
+        <w:rPr>
+          <w:sz w:val="26"/>
+        </w:rPr>
+        <w:t xml:space="preserve">Các commit được dẫn ghi nhận phiên bản mã nguồn nhóm đã hoàn thiện và đưa vào repo. Lịch sử hiện tại chủ yếu là các commit thêm file; repo không </w:t>
+      </w:r>
+      <w:r>
+        <w:rPr>
+          <w:sz w:val="26"/>
+        </w:rPr>
+        <w:t xml:space="preserve">lưu riêng bản nháp </w:t>
+      </w:r>
+      <w:r>
+        <w:rPr>
+          <w:sz w:val="26"/>
+        </w:rPr>
+        <w:lastRenderedPageBreak/>
+        <w:t>AI để so sánh trước–sau. Vì vậy, link commit dùng để đối chiếu nội dung, người đứng tên commit và kết quả kiểm thử; không dùng để khẳng định Git tự chứng minh từng dòng do AI hay sinh viên viết.</w:t>
+      </w:r>
+    </w:p>
+    <w:p>
+      <w:pPr>
+        <w:spacing w:after="120" w:line="360" w:lineRule="auto"/>
+        <w:jc w:val="both"/>
+      </w:pPr>
+      <w:r>
+        <w:rPr>
+          <w:sz w:val="26"/>
+        </w:rPr>
+        <w:t>Lần chạy GitHub Actions tại commit f92ab84</w:t>
+      </w:r>
+      <w:r>
+        <w:rPr>
+          <w:sz w:val="26"/>
+        </w:rPr>
+        <w:t>2641c61cba4c7c790ba85613f33ca26ae ghi nhận 19 passed trên Python 3.12, gồm 10 ca ảnh, 5 ca worker và 4 ca Flask. S3/DynamoDB trong các bài thử được giả lập; kết quả này chưa chứng minh luồng S3 → Lambda → S3/DynamoDB đã chạy hoàn chỉnh trên AWS. Ảnh cấu hì</w:t>
+      </w:r>
+      <w:r>
+        <w:rPr>
+          <w:sz w:val="26"/>
+        </w:rPr>
+        <w:t>nh AWS trong báo cáo được giữ để minh chứng phần tài nguyên đã chuẩn bị.</w:t>
+      </w:r>
+    </w:p>
+    <w:p>
+      <w:pPr>
+        <w:spacing w:after="120" w:line="360" w:lineRule="auto"/>
+        <w:jc w:val="both"/>
+      </w:pPr>
+      <w:r>
+        <w:rPr>
+          <w:sz w:val="26"/>
+        </w:rPr>
+        <w:t xml:space="preserve">Minh chứng kiểm thử: </w:t>
+      </w:r>
+      <w:hyperlink r:id="rId51">
+        <w:r>
+          <w:rPr>
+            <w:color w:val="0563C1"/>
+            <w:sz w:val="26"/>
+            <w:u w:val="single"/>
+          </w:rPr>
+          <w:t>GitHub Actions — 19/19 kiểm thử đạt</w:t>
+        </w:r>
+      </w:hyperlink>
+    </w:p>
+    <w:p>
+      <w:pPr>
+        <w:spacing w:after="120" w:line="360" w:lineRule="auto"/>
+        <w:jc w:val="both"/>
+      </w:pPr>
+      <w:r>
+        <w:rPr>
+          <w:sz w:val="26"/>
+        </w:rPr>
+        <w:t xml:space="preserve">Kho mã nguồn công khai: </w:t>
+      </w:r>
+      <w:hyperlink r:id="rId52">
+        <w:r>
+          <w:rPr>
+            <w:color w:val="0563C1"/>
+            <w:sz w:val="26"/>
+            <w:u w:val="single"/>
+          </w:rPr>
+          <w:t>bndt0103/aws-thumbnail</w:t>
+        </w:r>
+      </w:hyperlink>
+      <w:r>
+        <w:t xml:space="preserve"> — </w:t>
+      </w:r>
+      <w:hyperlink r:id="rId53">
+        <w:r>
+          <w:rPr>
+            <w:color w:val="0563C1"/>
+            <w:sz w:val="26"/>
+            <w:u w:val="single"/>
+          </w:rPr>
+          <w:t>Lịch sử commit</w:t>
+        </w:r>
+      </w:hyperlink>
+    </w:p>
+    <w:p>
+      <w:pPr>
+        <w:spacing w:after="120" w:line="360" w:lineRule="auto"/>
+        <w:jc w:val="both"/>
+      </w:pPr>
+      <w:r>
+        <w:rPr>
+          <w:sz w:val="26"/>
+        </w:rPr>
+        <w:t>Nhóm chịu trách nhiệm đối chiếu khai báo công cụ và prompt với quá trình làm việc thực tế; kiểm t</w:t>
+      </w:r>
+      <w:r>
+        <w:rPr>
+          <w:sz w:val="26"/>
+        </w:rPr>
+        <w:t>ra mã nguồn, kết quả kiểm thử và thông tin cấu hình trước khi nộp. AI hỗ trợ đề xuất và rà soát; kết quả tài nguyên AWS và phạm vi hoàn thành được trình bày theo minh chứng của tuần 1.</w:t>
+      </w:r>
+    </w:p>
+    <w:p>
+      <w:pPr>
         <w:pStyle w:val="Heading1"/>
         <w:jc w:val="center"/>
       </w:pPr>
-      <w:bookmarkStart w:id="44" w:name="_Toc242620496"/>
-      <w:bookmarkStart w:id="45" w:name="_Toc242621053"/>
-      <w:r>
-        <w:lastRenderedPageBreak/>
+      <w:bookmarkStart w:id="48" w:name="_Toc242620496"/>
+      <w:bookmarkStart w:id="49" w:name="_Toc242920050"/>
+      <w:r>
         <w:t>TÀI LIỆU THAM KHẢO</w:t>
       </w:r>
-      <w:bookmarkEnd w:id="44"/>
-      <w:bookmarkEnd w:id="45"/>
+      <w:bookmarkEnd w:id="48"/>
+      <w:bookmarkEnd w:id="49"/>
     </w:p>
     <w:p>
       <w:pPr>
@@ -5559,27 +6753,13 @@
       <w:r>
         <w:t xml:space="preserve">1. Amazon Web Services. </w:t>
       </w:r>
-      <w:hyperlink r:id="rId29">
+      <w:hyperlink r:id="rId54">
         <w:r>
           <w:rPr>
             <w:color w:val="245C96"/>
             <w:u w:val="single"/>
           </w:rPr>
-          <w:t>Creating a general p</w:t>
-        </w:r>
-        <w:r>
-          <w:rPr>
-            <w:color w:val="245C96"/>
-            <w:u w:val="single"/>
-          </w:rPr>
-          <w:t>u</w:t>
-        </w:r>
-        <w:r>
-          <w:rPr>
-            <w:color w:val="245C96"/>
-            <w:u w:val="single"/>
-          </w:rPr>
-          <w:t>rpose bucket</w:t>
+          <w:t>Creating a general purpose bucket</w:t>
         </w:r>
       </w:hyperlink>
       <w:r>
@@ -5594,7 +6774,7 @@
       <w:r>
         <w:t xml:space="preserve">2. Amazon Web Services. </w:t>
       </w:r>
-      <w:hyperlink r:id="rId30">
+      <w:hyperlink r:id="rId55">
         <w:r>
           <w:rPr>
             <w:color w:val="245C96"/>
@@ -5615,7 +6795,7 @@
       <w:r>
         <w:t xml:space="preserve">3. Amazon Web Services. </w:t>
       </w:r>
-      <w:hyperlink r:id="rId31">
+      <w:hyperlink r:id="rId56">
         <w:r>
           <w:rPr>
             <w:color w:val="245C96"/>
@@ -5636,7 +6816,7 @@
       <w:r>
         <w:t xml:space="preserve">4. Amazon Web Services. </w:t>
       </w:r>
-      <w:hyperlink r:id="rId32">
+      <w:hyperlink r:id="rId57">
         <w:r>
           <w:rPr>
             <w:color w:val="245C96"/>
@@ -5649,10 +6829,23 @@
         <w:t>.</w:t>
       </w:r>
     </w:p>
+    <w:p>
+      <w:r>
+        <w:t>5. Nhóm Serverless. Kho mã nguồn aws-thumbnail và các commit minh chứng. https://github.com/bndt0103</w:t>
+      </w:r>
+      <w:r>
+        <w:t>/aws-thumbnail. Đối chiếu ngày 15/10/2026.</w:t>
+      </w:r>
+    </w:p>
+    <w:p>
+      <w:r>
+        <w:t>6. GitHub Actions. Kết quả chạy 19 ca kiểm thử ở phiên bản f92ab84. https://github.com/bndt0103/aws-thumbnail/actions/runs/38563088053. Đối chiếu ngày 15/10/2026.</w:t>
+      </w:r>
+    </w:p>
     <w:sectPr>
-      <w:footerReference w:type="default" r:id="rId33"/>
-      <w:headerReference w:type="first" r:id="rId34"/>
-      <w:footerReference w:type="first" r:id="rId35"/>
+      <w:footerReference w:type="default" r:id="rId58"/>
+      <w:headerReference w:type="first" r:id="rId59"/>
+      <w:footerReference w:type="first" r:id="rId60"/>
       <w:pgSz w:w="11906" w:h="16838" w:code="9"/>
       <w:pgMar w:top="1418" w:right="1418" w:bottom="1418" w:left="1701" w:header="720" w:footer="567" w:gutter="0"/>
       <w:pgNumType w:start="1"/>
@@ -5664,7 +6857,7 @@
 </file>
 
 <file path=word/endnotes.xml><?xml version="1.0" encoding="utf-8"?>
-<w:endnotes xmlns:wpc="http://schemas.microsoft.com/office/word/2010/wordprocessingCanvas" xmlns:cx="http://schemas.microsoft.com/office/drawing/2014/chartex" xmlns:cx1="http://schemas.microsoft.com/office/drawing/2015/9/8/chartex" xmlns:cx2="http://schemas.microsoft.com/office/drawing/2015/10/21/chartex" xmlns:cx3="http://schemas.microsoft.com/office/drawing/2016/5/9/chartex" xmlns:cx4="http://schemas.microsoft.com/office/drawing/2016/5/10/chartex" xmlns:cx5="http://schemas.microsoft.com/office/drawing/2016/5/11/chartex" xmlns:cx6="http://schemas.microsoft.com/office/drawing/2016/5/12/chartex" xmlns:cx7="http://schemas.microsoft.com/office/drawing/2016/5/13/chartex" xmlns:cx8="http://schemas.microsoft.com/office/drawing/2016/5/14/chartex" xmlns:mc="http://schemas.openxmlformats.org/markup-compatibility/2006" xmlns:aink="http://schemas.microsoft.com/office/drawing/2016/ink" xmlns:am3d="http://schemas.microsoft.com/office/drawing/2017/model3d" xmlns:o="urn:schemas-microsoft-com:office:office" xmlns:oel="http://schemas.microsoft.com/office/2019/extlst" xmlns:r="http://schemas.openxmlformats.org/officeDocument/2006/relationships" xmlns:m="http://schemas.openxmlformats.org/officeDocument/2006/math" xmlns:v="urn:schemas-microsoft-com:vml" xmlns:wp14="http://schemas.microsoft.com/office/word/2010/wordprocessingDrawing" xmlns:wp="http://schemas.openxmlformats.org/drawingml/2006/wordprocessingDrawing" xmlns:w10="urn:schemas-microsoft-com:office:word" xmlns:w="http://schemas.openxmlformats.org/wordprocessingml/2006/main" xmlns:w14="http://schemas.microsoft.com/office/word/2010/wordml" xmlns:w15="http://schemas.microsoft.com/office/word/2012/wordml" xmlns:w16cex="http://schemas.microsoft.com/office/word/2018/wordml/cex" xmlns:w16cid="http://schemas.microsoft.com/office/word/2016/wordml/cid" xmlns:w16="http://schemas.microsoft.com/office/word/2018/wordml" xmlns:w16du="http://schemas.microsoft.com/office/word/2023/wordml/word16du" xmlns:w16sdtdh="http://schemas.microsoft.com/office/word/2020/wordml/sdtdatahash" xmlns:w16sdtfl="http://schemas.microsoft.com/office/word/2024/wordml/sdtformatlock" xmlns:w16se="http://schemas.microsoft.com/office/word/2015/wordml/symex" xmlns:wpg="http://schemas.microsoft.com/office/word/2010/wordprocessingGroup" xmlns:wpi="http://schemas.microsoft.com/office/word/2010/wordprocessingInk" xmlns:wne="http://schemas.microsoft.com/office/word/2006/wordml" xmlns:wps="http://schemas.microsoft.com/office/word/2010/wordprocessingShape" mc:Ignorable="w14 w15 w16se w16cid w16 w16cex w16sdtdh w16sdtfl w16du wp14">
+<w:endnotes xmlns:wpc="http://schemas.microsoft.com/office/word/2010/wordprocessingCanvas" xmlns:cx="http://schemas.microsoft.com/office/drawing/2014/chartex" xmlns:cx1="http://schemas.microsoft.com/office/drawing/2015/9/8/chartex" xmlns:cx2="http://schemas.microsoft.com/office/drawing/2015/10/21/chartex" xmlns:cx3="http://schemas.microsoft.com/office/drawing/2016/5/9/chartex" xmlns:cx4="http://schemas.microsoft.com/office/drawing/2016/5/10/chartex" xmlns:cx5="http://schemas.microsoft.com/office/drawing/2016/5/11/chartex" xmlns:cx6="http://schemas.microsoft.com/office/drawing/2016/5/12/chartex" xmlns:cx7="http://schemas.microsoft.com/office/drawing/2016/5/13/chartex" xmlns:cx8="http://schemas.microsoft.com/office/drawing/2016/5/14/chartex" xmlns:mc="http://schemas.openxmlformats.org/markup-compatibility/2006" xmlns:aink="http://schemas.microsoft.com/office/drawing/2016/ink" xmlns:am3d="http://schemas.microsoft.com/office/drawing/2017/model3d" xmlns:o="urn:schemas-microsoft-com:office:office" xmlns:r="http://schemas.openxmlformats.org/officeDocument/2006/relationships" xmlns:m="http://schemas.openxmlformats.org/officeDocument/2006/math" xmlns:v="urn:schemas-microsoft-com:vml" xmlns:wp14="http://schemas.microsoft.com/office/word/2010/wordprocessingDrawing" xmlns:wp="http://schemas.openxmlformats.org/drawingml/2006/wordprocessingDrawing" xmlns:w10="urn:schemas-microsoft-com:office:word" xmlns:w="http://schemas.openxmlformats.org/wordprocessingml/2006/main" xmlns:w14="http://schemas.microsoft.com/office/word/2010/wordml" xmlns:w15="http://schemas.microsoft.com/office/word/2012/wordml" xmlns:w16cex="http://schemas.microsoft.com/office/word/2018/wordml/cex" xmlns:w16cid="http://schemas.microsoft.com/office/word/2016/wordml/cid" xmlns:w16="http://schemas.microsoft.com/office/word/2018/wordml" xmlns:w16sdtdh="http://schemas.microsoft.com/office/word/2020/wordml/sdtdatahash" xmlns:w16se="http://schemas.microsoft.com/office/word/2015/wordml/symex" xmlns:wpg="http://schemas.microsoft.com/office/word/2010/wordprocessingGroup" xmlns:wpi="http://schemas.microsoft.com/office/word/2010/wordprocessingInk" xmlns:wne="http://schemas.microsoft.com/office/word/2006/wordml" xmlns:wps="http://schemas.microsoft.com/office/word/2010/wordprocessingShape" mc:Ignorable="w14 w15 w16se w16cid w16 w16cex w16sdtdh wp14">
   <w:endnote w:type="separator" w:id="-1">
     <w:p>
       <w:pPr>
@@ -5689,7 +6882,7 @@
 </file>
 
 <file path=word/footer1.xml><?xml version="1.0" encoding="utf-8"?>
-<w:ftr xmlns:wpc="http://schemas.microsoft.com/office/word/2010/wordprocessingCanvas" xmlns:cx="http://schemas.microsoft.com/office/drawing/2014/chartex" xmlns:cx1="http://schemas.microsoft.com/office/drawing/2015/9/8/chartex" xmlns:cx2="http://schemas.microsoft.com/office/drawing/2015/10/21/chartex" xmlns:cx3="http://schemas.microsoft.com/office/drawing/2016/5/9/chartex" xmlns:cx4="http://schemas.microsoft.com/office/drawing/2016/5/10/chartex" xmlns:cx5="http://schemas.microsoft.com/office/drawing/2016/5/11/chartex" xmlns:cx6="http://schemas.microsoft.com/office/drawing/2016/5/12/chartex" xmlns:cx7="http://schemas.microsoft.com/office/drawing/2016/5/13/chartex" xmlns:cx8="http://schemas.microsoft.com/office/drawing/2016/5/14/chartex" xmlns:mc="http://schemas.openxmlformats.org/markup-compatibility/2006" xmlns:aink="http://schemas.microsoft.com/office/drawing/2016/ink" xmlns:am3d="http://schemas.microsoft.com/office/drawing/2017/model3d" xmlns:o="urn:schemas-microsoft-com:office:office" xmlns:oel="http://schemas.microsoft.com/office/2019/extlst" xmlns:r="http://schemas.openxmlformats.org/officeDocument/2006/relationships" xmlns:m="http://schemas.openxmlformats.org/officeDocument/2006/math" xmlns:v="urn:schemas-microsoft-com:vml" xmlns:wp14="http://schemas.microsoft.com/office/word/2010/wordprocessingDrawing" xmlns:wp="http://schemas.openxmlformats.org/drawingml/2006/wordprocessingDrawing" xmlns:w10="urn:schemas-microsoft-com:office:word" xmlns:w="http://schemas.openxmlformats.org/wordprocessingml/2006/main" xmlns:w14="http://schemas.microsoft.com/office/word/2010/wordml" xmlns:w15="http://schemas.microsoft.com/office/word/2012/wordml" xmlns:w16cex="http://schemas.microsoft.com/office/word/2018/wordml/cex" xmlns:w16cid="http://schemas.microsoft.com/office/word/2016/wordml/cid" xmlns:w16="http://schemas.microsoft.com/office/word/2018/wordml" xmlns:w16du="http://schemas.microsoft.com/office/word/2023/wordml/word16du" xmlns:w16sdtdh="http://schemas.microsoft.com/office/word/2020/wordml/sdtdatahash" xmlns:w16sdtfl="http://schemas.microsoft.com/office/word/2024/wordml/sdtformatlock" xmlns:w16se="http://schemas.microsoft.com/office/word/2015/wordml/symex" xmlns:wpg="http://schemas.microsoft.com/office/word/2010/wordprocessingGroup" xmlns:wpi="http://schemas.microsoft.com/office/word/2010/wordprocessingInk" xmlns:wne="http://schemas.microsoft.com/office/word/2006/wordml" xmlns:wps="http://schemas.microsoft.com/office/word/2010/wordprocessingShape" mc:Ignorable="w14 w15 w16se w16cid w16 w16cex w16sdtdh w16sdtfl w16du wp14">
+<w:ftr xmlns:wpc="http://schemas.microsoft.com/office/word/2010/wordprocessingCanvas" xmlns:cx="http://schemas.microsoft.com/office/drawing/2014/chartex" xmlns:cx1="http://schemas.microsoft.com/office/drawing/2015/9/8/chartex" xmlns:cx2="http://schemas.microsoft.com/office/drawing/2015/10/21/chartex" xmlns:cx3="http://schemas.microsoft.com/office/drawing/2016/5/9/chartex" xmlns:cx4="http://schemas.microsoft.com/office/drawing/2016/5/10/chartex" xmlns:cx5="http://schemas.microsoft.com/office/drawing/2016/5/11/chartex" xmlns:cx6="http://schemas.microsoft.com/office/drawing/2016/5/12/chartex" xmlns:cx7="http://schemas.microsoft.com/office/drawing/2016/5/13/chartex" xmlns:cx8="http://schemas.microsoft.com/office/drawing/2016/5/14/chartex" xmlns:mc="http://schemas.openxmlformats.org/markup-compatibility/2006" xmlns:aink="http://schemas.microsoft.com/office/drawing/2016/ink" xmlns:am3d="http://schemas.microsoft.com/office/drawing/2017/model3d" xmlns:o="urn:schemas-microsoft-com:office:office" xmlns:r="http://schemas.openxmlformats.org/officeDocument/2006/relationships" xmlns:m="http://schemas.openxmlformats.org/officeDocument/2006/math" xmlns:v="urn:schemas-microsoft-com:vml" xmlns:wp14="http://schemas.microsoft.com/office/word/2010/wordprocessingDrawing" xmlns:wp="http://schemas.openxmlformats.org/drawingml/2006/wordprocessingDrawing" xmlns:w10="urn:schemas-microsoft-com:office:word" xmlns:w="http://schemas.openxmlformats.org/wordprocessingml/2006/main" xmlns:w14="http://schemas.microsoft.com/office/word/2010/wordml" xmlns:w15="http://schemas.microsoft.com/office/word/2012/wordml" xmlns:w16cex="http://schemas.microsoft.com/office/word/2018/wordml/cex" xmlns:w16cid="http://schemas.microsoft.com/office/word/2016/wordml/cid" xmlns:w16="http://schemas.microsoft.com/office/word/2018/wordml" xmlns:w16sdtdh="http://schemas.microsoft.com/office/word/2020/wordml/sdtdatahash" xmlns:w16se="http://schemas.microsoft.com/office/word/2015/wordml/symex" xmlns:wpg="http://schemas.microsoft.com/office/word/2010/wordprocessingGroup" xmlns:wpi="http://schemas.microsoft.com/office/word/2010/wordprocessingInk" xmlns:wne="http://schemas.microsoft.com/office/word/2006/wordml" xmlns:wps="http://schemas.microsoft.com/office/word/2010/wordprocessingShape" mc:Ignorable="w14 w15 w16se w16cid w16 w16cex w16sdtdh wp14">
   <w:p>
     <w:pPr>
       <w:pStyle w:val="Footer"/>
@@ -5705,7 +6898,7 @@
 </file>
 
 <file path=word/footer2.xml><?xml version="1.0" encoding="utf-8"?>
-<w:ftr xmlns:wpc="http://schemas.microsoft.com/office/word/2010/wordprocessingCanvas" xmlns:cx="http://schemas.microsoft.com/office/drawing/2014/chartex" xmlns:cx1="http://schemas.microsoft.com/office/drawing/2015/9/8/chartex" xmlns:cx2="http://schemas.microsoft.com/office/drawing/2015/10/21/chartex" xmlns:cx3="http://schemas.microsoft.com/office/drawing/2016/5/9/chartex" xmlns:cx4="http://schemas.microsoft.com/office/drawing/2016/5/10/chartex" xmlns:cx5="http://schemas.microsoft.com/office/drawing/2016/5/11/chartex" xmlns:cx6="http://schemas.microsoft.com/office/drawing/2016/5/12/chartex" xmlns:cx7="http://schemas.microsoft.com/office/drawing/2016/5/13/chartex" xmlns:cx8="http://schemas.microsoft.com/office/drawing/2016/5/14/chartex" xmlns:mc="http://schemas.openxmlformats.org/markup-compatibility/2006" xmlns:aink="http://schemas.microsoft.com/office/drawing/2016/ink" xmlns:am3d="http://schemas.microsoft.com/office/drawing/2017/model3d" xmlns:o="urn:schemas-microsoft-com:office:office" xmlns:oel="http://schemas.microsoft.com/office/2019/extlst" xmlns:r="http://schemas.openxmlformats.org/officeDocument/2006/relationships" xmlns:m="http://schemas.openxmlformats.org/officeDocument/2006/math" xmlns:v="urn:schemas-microsoft-com:vml" xmlns:wp14="http://schemas.microsoft.com/office/word/2010/wordprocessingDrawing" xmlns:wp="http://schemas.openxmlformats.org/drawingml/2006/wordprocessingDrawing" xmlns:w10="urn:schemas-microsoft-com:office:word" xmlns:w="http://schemas.openxmlformats.org/wordprocessingml/2006/main" xmlns:w14="http://schemas.microsoft.com/office/word/2010/wordml" xmlns:w15="http://schemas.microsoft.com/office/word/2012/wordml" xmlns:w16cex="http://schemas.microsoft.com/office/word/2018/wordml/cex" xmlns:w16cid="http://schemas.microsoft.com/office/word/2016/wordml/cid" xmlns:w16="http://schemas.microsoft.com/office/word/2018/wordml" xmlns:w16du="http://schemas.microsoft.com/office/word/2023/wordml/word16du" xmlns:w16sdtdh="http://schemas.microsoft.com/office/word/2020/wordml/sdtdatahash" xmlns:w16sdtfl="http://schemas.microsoft.com/office/word/2024/wordml/sdtformatlock" xmlns:w16se="http://schemas.microsoft.com/office/word/2015/wordml/symex" xmlns:wpg="http://schemas.microsoft.com/office/word/2010/wordprocessingGroup" xmlns:wpi="http://schemas.microsoft.com/office/word/2010/wordprocessingInk" xmlns:wne="http://schemas.microsoft.com/office/word/2006/wordml" xmlns:wps="http://schemas.microsoft.com/office/word/2010/wordprocessingShape" mc:Ignorable="w14 w15 w16se w16cid w16 w16cex w16sdtdh w16sdtfl w16du wp14">
+<w:ftr xmlns:wpc="http://schemas.microsoft.com/office/word/2010/wordprocessingCanvas" xmlns:cx="http://schemas.microsoft.com/office/drawing/2014/chartex" xmlns:cx1="http://schemas.microsoft.com/office/drawing/2015/9/8/chartex" xmlns:cx2="http://schemas.microsoft.com/office/drawing/2015/10/21/chartex" xmlns:cx3="http://schemas.microsoft.com/office/drawing/2016/5/9/chartex" xmlns:cx4="http://schemas.microsoft.com/office/drawing/2016/5/10/chartex" xmlns:cx5="http://schemas.microsoft.com/office/drawing/2016/5/11/chartex" xmlns:cx6="http://schemas.microsoft.com/office/drawing/2016/5/12/chartex" xmlns:cx7="http://schemas.microsoft.com/office/drawing/2016/5/13/chartex" xmlns:cx8="http://schemas.microsoft.com/office/drawing/2016/5/14/chartex" xmlns:mc="http://schemas.openxmlformats.org/markup-compatibility/2006" xmlns:aink="http://schemas.microsoft.com/office/drawing/2016/ink" xmlns:am3d="http://schemas.microsoft.com/office/drawing/2017/model3d" xmlns:o="urn:schemas-microsoft-com:office:office" xmlns:r="http://schemas.openxmlformats.org/officeDocument/2006/relationships" xmlns:m="http://schemas.openxmlformats.org/officeDocument/2006/math" xmlns:v="urn:schemas-microsoft-com:vml" xmlns:wp14="http://schemas.microsoft.com/office/word/2010/wordprocessingDrawing" xmlns:wp="http://schemas.openxmlformats.org/drawingml/2006/wordprocessingDrawing" xmlns:w10="urn:schemas-microsoft-com:office:word" xmlns:w="http://schemas.openxmlformats.org/wordprocessingml/2006/main" xmlns:w14="http://schemas.microsoft.com/office/word/2010/wordml" xmlns:w15="http://schemas.microsoft.com/office/word/2012/wordml" xmlns:w16cex="http://schemas.microsoft.com/office/word/2018/wordml/cex" xmlns:w16cid="http://schemas.microsoft.com/office/word/2016/wordml/cid" xmlns:w16="http://schemas.microsoft.com/office/word/2018/wordml" xmlns:w16sdtdh="http://schemas.microsoft.com/office/word/2020/wordml/sdtdatahash" xmlns:w16se="http://schemas.microsoft.com/office/word/2015/wordml/symex" xmlns:wpg="http://schemas.microsoft.com/office/word/2010/wordprocessingGroup" xmlns:wpi="http://schemas.microsoft.com/office/word/2010/wordprocessingInk" xmlns:wne="http://schemas.microsoft.com/office/word/2006/wordml" xmlns:wps="http://schemas.microsoft.com/office/word/2010/wordprocessingShape" mc:Ignorable="w14 w15 w16se w16cid w16 w16cex w16sdtdh wp14">
   <w:p>
     <w:pPr>
       <w:pStyle w:val="Footer"/>
@@ -5721,7 +6914,7 @@
 </file>
 
 <file path=word/footer3.xml><?xml version="1.0" encoding="utf-8"?>
-<w:ftr xmlns:wpc="http://schemas.microsoft.com/office/word/2010/wordprocessingCanvas" xmlns:cx="http://schemas.microsoft.com/office/drawing/2014/chartex" xmlns:cx1="http://schemas.microsoft.com/office/drawing/2015/9/8/chartex" xmlns:cx2="http://schemas.microsoft.com/office/drawing/2015/10/21/chartex" xmlns:cx3="http://schemas.microsoft.com/office/drawing/2016/5/9/chartex" xmlns:cx4="http://schemas.microsoft.com/office/drawing/2016/5/10/chartex" xmlns:cx5="http://schemas.microsoft.com/office/drawing/2016/5/11/chartex" xmlns:cx6="http://schemas.microsoft.com/office/drawing/2016/5/12/chartex" xmlns:cx7="http://schemas.microsoft.com/office/drawing/2016/5/13/chartex" xmlns:cx8="http://schemas.microsoft.com/office/drawing/2016/5/14/chartex" xmlns:mc="http://schemas.openxmlformats.org/markup-compatibility/2006" xmlns:aink="http://schemas.microsoft.com/office/drawing/2016/ink" xmlns:am3d="http://schemas.microsoft.com/office/drawing/2017/model3d" xmlns:o="urn:schemas-microsoft-com:office:office" xmlns:oel="http://schemas.microsoft.com/office/2019/extlst" xmlns:r="http://schemas.openxmlformats.org/officeDocument/2006/relationships" xmlns:m="http://schemas.openxmlformats.org/officeDocument/2006/math" xmlns:v="urn:schemas-microsoft-com:vml" xmlns:wp14="http://schemas.microsoft.com/office/word/2010/wordprocessingDrawing" xmlns:wp="http://schemas.openxmlformats.org/drawingml/2006/wordprocessingDrawing" xmlns:w10="urn:schemas-microsoft-com:office:word" xmlns:w="http://schemas.openxmlformats.org/wordprocessingml/2006/main" xmlns:w14="http://schemas.microsoft.com/office/word/2010/wordml" xmlns:w15="http://schemas.microsoft.com/office/word/2012/wordml" xmlns:w16cex="http://schemas.microsoft.com/office/word/2018/wordml/cex" xmlns:w16cid="http://schemas.microsoft.com/office/word/2016/wordml/cid" xmlns:w16="http://schemas.microsoft.com/office/word/2018/wordml" xmlns:w16du="http://schemas.microsoft.com/office/word/2023/wordml/word16du" xmlns:w16sdtdh="http://schemas.microsoft.com/office/word/2020/wordml/sdtdatahash" xmlns:w16sdtfl="http://schemas.microsoft.com/office/word/2024/wordml/sdtformatlock" xmlns:w16se="http://schemas.microsoft.com/office/word/2015/wordml/symex" xmlns:wpg="http://schemas.microsoft.com/office/word/2010/wordprocessingGroup" xmlns:wpi="http://schemas.microsoft.com/office/word/2010/wordprocessingInk" xmlns:wne="http://schemas.microsoft.com/office/word/2006/wordml" xmlns:wps="http://schemas.microsoft.com/office/word/2010/wordprocessingShape" mc:Ignorable="w14 w15 w16se w16cid w16 w16cex w16sdtdh w16sdtfl w16du wp14">
+<w:ftr xmlns:wpc="http://schemas.microsoft.com/office/word/2010/wordprocessingCanvas" xmlns:cx="http://schemas.microsoft.com/office/drawing/2014/chartex" xmlns:cx1="http://schemas.microsoft.com/office/drawing/2015/9/8/chartex" xmlns:cx2="http://schemas.microsoft.com/office/drawing/2015/10/21/chartex" xmlns:cx3="http://schemas.microsoft.com/office/drawing/2016/5/9/chartex" xmlns:cx4="http://schemas.microsoft.com/office/drawing/2016/5/10/chartex" xmlns:cx5="http://schemas.microsoft.com/office/drawing/2016/5/11/chartex" xmlns:cx6="http://schemas.microsoft.com/office/drawing/2016/5/12/chartex" xmlns:cx7="http://schemas.microsoft.com/office/drawing/2016/5/13/chartex" xmlns:cx8="http://schemas.microsoft.com/office/drawing/2016/5/14/chartex" xmlns:mc="http://schemas.openxmlformats.org/markup-compatibility/2006" xmlns:aink="http://schemas.microsoft.com/office/drawing/2016/ink" xmlns:am3d="http://schemas.microsoft.com/office/drawing/2017/model3d" xmlns:o="urn:schemas-microsoft-com:office:office" xmlns:r="http://schemas.openxmlformats.org/officeDocument/2006/relationships" xmlns:m="http://schemas.openxmlformats.org/officeDocument/2006/math" xmlns:v="urn:schemas-microsoft-com:vml" xmlns:wp14="http://schemas.microsoft.com/office/word/2010/wordprocessingDrawing" xmlns:wp="http://schemas.openxmlformats.org/drawingml/2006/wordprocessingDrawing" xmlns:w10="urn:schemas-microsoft-com:office:word" xmlns:w="http://schemas.openxmlformats.org/wordprocessingml/2006/main" xmlns:w14="http://schemas.microsoft.com/office/word/2010/wordml" xmlns:w15="http://schemas.microsoft.com/office/word/2012/wordml" xmlns:w16cex="http://schemas.microsoft.com/office/word/2018/wordml/cex" xmlns:w16cid="http://schemas.microsoft.com/office/word/2016/wordml/cid" xmlns:w16="http://schemas.microsoft.com/office/word/2018/wordml" xmlns:w16sdtdh="http://schemas.microsoft.com/office/word/2020/wordml/sdtdatahash" xmlns:w16se="http://schemas.microsoft.com/office/word/2015/wordml/symex" xmlns:wpg="http://schemas.microsoft.com/office/word/2010/wordprocessingGroup" xmlns:wpi="http://schemas.microsoft.com/office/word/2010/wordprocessingInk" xmlns:wne="http://schemas.microsoft.com/office/word/2006/wordml" xmlns:wps="http://schemas.microsoft.com/office/word/2010/wordprocessingShape" mc:Ignorable="w14 w15 w16se w16cid w16 w16cex w16sdtdh wp14">
   <w:sdt>
     <w:sdtPr>
       <w:id w:val="1920591899"/>
@@ -5796,7 +6989,7 @@
 </file>
 
 <file path=word/footer4.xml><?xml version="1.0" encoding="utf-8"?>
-<w:ftr xmlns:wpc="http://schemas.microsoft.com/office/word/2010/wordprocessingCanvas" xmlns:cx="http://schemas.microsoft.com/office/drawing/2014/chartex" xmlns:cx1="http://schemas.microsoft.com/office/drawing/2015/9/8/chartex" xmlns:cx2="http://schemas.microsoft.com/office/drawing/2015/10/21/chartex" xmlns:cx3="http://schemas.microsoft.com/office/drawing/2016/5/9/chartex" xmlns:cx4="http://schemas.microsoft.com/office/drawing/2016/5/10/chartex" xmlns:cx5="http://schemas.microsoft.com/office/drawing/2016/5/11/chartex" xmlns:cx6="http://schemas.microsoft.com/office/drawing/2016/5/12/chartex" xmlns:cx7="http://schemas.microsoft.com/office/drawing/2016/5/13/chartex" xmlns:cx8="http://schemas.microsoft.com/office/drawing/2016/5/14/chartex" xmlns:mc="http://schemas.openxmlformats.org/markup-compatibility/2006" xmlns:aink="http://schemas.microsoft.com/office/drawing/2016/ink" xmlns:am3d="http://schemas.microsoft.com/office/drawing/2017/model3d" xmlns:o="urn:schemas-microsoft-com:office:office" xmlns:oel="http://schemas.microsoft.com/office/2019/extlst" xmlns:r="http://schemas.openxmlformats.org/officeDocument/2006/relationships" xmlns:m="http://schemas.openxmlformats.org/officeDocument/2006/math" xmlns:v="urn:schemas-microsoft-com:vml" xmlns:wp14="http://schemas.microsoft.com/office/word/2010/wordprocessingDrawing" xmlns:wp="http://schemas.openxmlformats.org/drawingml/2006/wordprocessingDrawing" xmlns:w10="urn:schemas-microsoft-com:office:word" xmlns:w="http://schemas.openxmlformats.org/wordprocessingml/2006/main" xmlns:w14="http://schemas.microsoft.com/office/word/2010/wordml" xmlns:w15="http://schemas.microsoft.com/office/word/2012/wordml" xmlns:w16cex="http://schemas.microsoft.com/office/word/2018/wordml/cex" xmlns:w16cid="http://schemas.microsoft.com/office/word/2016/wordml/cid" xmlns:w16="http://schemas.microsoft.com/office/word/2018/wordml" xmlns:w16du="http://schemas.microsoft.com/office/word/2023/wordml/word16du" xmlns:w16sdtdh="http://schemas.microsoft.com/office/word/2020/wordml/sdtdatahash" xmlns:w16sdtfl="http://schemas.microsoft.com/office/word/2024/wordml/sdtformatlock" xmlns:w16se="http://schemas.microsoft.com/office/word/2015/wordml/symex" xmlns:wpg="http://schemas.microsoft.com/office/word/2010/wordprocessingGroup" xmlns:wpi="http://schemas.microsoft.com/office/word/2010/wordprocessingInk" xmlns:wne="http://schemas.microsoft.com/office/word/2006/wordml" xmlns:wps="http://schemas.microsoft.com/office/word/2010/wordprocessingShape" mc:Ignorable="w14 w15 w16se w16cid w16 w16cex w16sdtdh w16sdtfl w16du wp14">
+<w:ftr xmlns:wpc="http://schemas.microsoft.com/office/word/2010/wordprocessingCanvas" xmlns:cx="http://schemas.microsoft.com/office/drawing/2014/chartex" xmlns:cx1="http://schemas.microsoft.com/office/drawing/2015/9/8/chartex" xmlns:cx2="http://schemas.microsoft.com/office/drawing/2015/10/21/chartex" xmlns:cx3="http://schemas.microsoft.com/office/drawing/2016/5/9/chartex" xmlns:cx4="http://schemas.microsoft.com/office/drawing/2016/5/10/chartex" xmlns:cx5="http://schemas.microsoft.com/office/drawing/2016/5/11/chartex" xmlns:cx6="http://schemas.microsoft.com/office/drawing/2016/5/12/chartex" xmlns:cx7="http://schemas.microsoft.com/office/drawing/2016/5/13/chartex" xmlns:cx8="http://schemas.microsoft.com/office/drawing/2016/5/14/chartex" xmlns:mc="http://schemas.openxmlformats.org/markup-compatibility/2006" xmlns:aink="http://schemas.microsoft.com/office/drawing/2016/ink" xmlns:am3d="http://schemas.microsoft.com/office/drawing/2017/model3d" xmlns:o="urn:schemas-microsoft-com:office:office" xmlns:r="http://schemas.openxmlformats.org/officeDocument/2006/relationships" xmlns:m="http://schemas.openxmlformats.org/officeDocument/2006/math" xmlns:v="urn:schemas-microsoft-com:vml" xmlns:wp14="http://schemas.microsoft.com/office/word/2010/wordprocessingDrawing" xmlns:wp="http://schemas.openxmlformats.org/drawingml/2006/wordprocessingDrawing" xmlns:w10="urn:schemas-microsoft-com:office:word" xmlns:w="http://schemas.openxmlformats.org/wordprocessingml/2006/main" xmlns:w14="http://schemas.microsoft.com/office/word/2010/wordml" xmlns:w15="http://schemas.microsoft.com/office/word/2012/wordml" xmlns:w16cex="http://schemas.microsoft.com/office/word/2018/wordml/cex" xmlns:w16cid="http://schemas.microsoft.com/office/word/2016/wordml/cid" xmlns:w16="http://schemas.microsoft.com/office/word/2018/wordml" xmlns:w16sdtdh="http://schemas.microsoft.com/office/word/2020/wordml/sdtdatahash" xmlns:w16se="http://schemas.microsoft.com/office/word/2015/wordml/symex" xmlns:wpg="http://schemas.microsoft.com/office/word/2010/wordprocessingGroup" xmlns:wpi="http://schemas.microsoft.com/office/word/2010/wordprocessingInk" xmlns:wne="http://schemas.microsoft.com/office/word/2006/wordml" xmlns:wps="http://schemas.microsoft.com/office/word/2010/wordprocessingShape" mc:Ignorable="w14 w15 w16se w16cid w16 w16cex w16sdtdh wp14">
   <w:sdt>
     <w:sdtPr>
       <w:id w:val="-1560467979"/>
@@ -5849,7 +7042,7 @@
 </file>
 
 <file path=word/footnotes.xml><?xml version="1.0" encoding="utf-8"?>
-<w:footnotes xmlns:wpc="http://schemas.microsoft.com/office/word/2010/wordprocessingCanvas" xmlns:cx="http://schemas.microsoft.com/office/drawing/2014/chartex" xmlns:cx1="http://schemas.microsoft.com/office/drawing/2015/9/8/chartex" xmlns:cx2="http://schemas.microsoft.com/office/drawing/2015/10/21/chartex" xmlns:cx3="http://schemas.microsoft.com/office/drawing/2016/5/9/chartex" xmlns:cx4="http://schemas.microsoft.com/office/drawing/2016/5/10/chartex" xmlns:cx5="http://schemas.microsoft.com/office/drawing/2016/5/11/chartex" xmlns:cx6="http://schemas.microsoft.com/office/drawing/2016/5/12/chartex" xmlns:cx7="http://schemas.microsoft.com/office/drawing/2016/5/13/chartex" xmlns:cx8="http://schemas.microsoft.com/office/drawing/2016/5/14/chartex" xmlns:mc="http://schemas.openxmlformats.org/markup-compatibility/2006" xmlns:aink="http://schemas.microsoft.com/office/drawing/2016/ink" xmlns:am3d="http://schemas.microsoft.com/office/drawing/2017/model3d" xmlns:o="urn:schemas-microsoft-com:office:office" xmlns:oel="http://schemas.microsoft.com/office/2019/extlst" xmlns:r="http://schemas.openxmlformats.org/officeDocument/2006/relationships" xmlns:m="http://schemas.openxmlformats.org/officeDocument/2006/math" xmlns:v="urn:schemas-microsoft-com:vml" xmlns:wp14="http://schemas.microsoft.com/office/word/2010/wordprocessingDrawing" xmlns:wp="http://schemas.openxmlformats.org/drawingml/2006/wordprocessingDrawing" xmlns:w10="urn:schemas-microsoft-com:office:word" xmlns:w="http://schemas.openxmlformats.org/wordprocessingml/2006/main" xmlns:w14="http://schemas.microsoft.com/office/word/2010/wordml" xmlns:w15="http://schemas.microsoft.com/office/word/2012/wordml" xmlns:w16cex="http://schemas.microsoft.com/office/word/2018/wordml/cex" xmlns:w16cid="http://schemas.microsoft.com/office/word/2016/wordml/cid" xmlns:w16="http://schemas.microsoft.com/office/word/2018/wordml" xmlns:w16du="http://schemas.microsoft.com/office/word/2023/wordml/word16du" xmlns:w16sdtdh="http://schemas.microsoft.com/office/word/2020/wordml/sdtdatahash" xmlns:w16sdtfl="http://schemas.microsoft.com/office/word/2024/wordml/sdtformatlock" xmlns:w16se="http://schemas.microsoft.com/office/word/2015/wordml/symex" xmlns:wpg="http://schemas.microsoft.com/office/word/2010/wordprocessingGroup" xmlns:wpi="http://schemas.microsoft.com/office/word/2010/wordprocessingInk" xmlns:wne="http://schemas.microsoft.com/office/word/2006/wordml" xmlns:wps="http://schemas.microsoft.com/office/word/2010/wordprocessingShape" mc:Ignorable="w14 w15 w16se w16cid w16 w16cex w16sdtdh w16sdtfl w16du wp14">
+<w:footnotes xmlns:wpc="http://schemas.microsoft.com/office/word/2010/wordprocessingCanvas" xmlns:cx="http://schemas.microsoft.com/office/drawing/2014/chartex" xmlns:cx1="http://schemas.microsoft.com/office/drawing/2015/9/8/chartex" xmlns:cx2="http://schemas.microsoft.com/office/drawing/2015/10/21/chartex" xmlns:cx3="http://schemas.microsoft.com/office/drawing/2016/5/9/chartex" xmlns:cx4="http://schemas.microsoft.com/office/drawing/2016/5/10/chartex" xmlns:cx5="http://schemas.microsoft.com/office/drawing/2016/5/11/chartex" xmlns:cx6="http://schemas.microsoft.com/office/drawing/2016/5/12/chartex" xmlns:cx7="http://schemas.microsoft.com/office/drawing/2016/5/13/chartex" xmlns:cx8="http://schemas.microsoft.com/office/drawing/2016/5/14/chartex" xmlns:mc="http://schemas.openxmlformats.org/markup-compatibility/2006" xmlns:aink="http://schemas.microsoft.com/office/drawing/2016/ink" xmlns:am3d="http://schemas.microsoft.com/office/drawing/2017/model3d" xmlns:o="urn:schemas-microsoft-com:office:office" xmlns:r="http://schemas.openxmlformats.org/officeDocument/2006/relationships" xmlns:m="http://schemas.openxmlformats.org/officeDocument/2006/math" xmlns:v="urn:schemas-microsoft-com:vml" xmlns:wp14="http://schemas.microsoft.com/office/word/2010/wordprocessingDrawing" xmlns:wp="http://schemas.openxmlformats.org/drawingml/2006/wordprocessingDrawing" xmlns:w10="urn:schemas-microsoft-com:office:word" xmlns:w="http://schemas.openxmlformats.org/wordprocessingml/2006/main" xmlns:w14="http://schemas.microsoft.com/office/word/2010/wordml" xmlns:w15="http://schemas.microsoft.com/office/word/2012/wordml" xmlns:w16cex="http://schemas.microsoft.com/office/word/2018/wordml/cex" xmlns:w16cid="http://schemas.microsoft.com/office/word/2016/wordml/cid" xmlns:w16="http://schemas.microsoft.com/office/word/2018/wordml" xmlns:w16sdtdh="http://schemas.microsoft.com/office/word/2020/wordml/sdtdatahash" xmlns:w16se="http://schemas.microsoft.com/office/word/2015/wordml/symex" xmlns:wpg="http://schemas.microsoft.com/office/word/2010/wordprocessingGroup" xmlns:wpi="http://schemas.microsoft.com/office/word/2010/wordprocessingInk" xmlns:wne="http://schemas.microsoft.com/office/word/2006/wordml" xmlns:wps="http://schemas.microsoft.com/office/word/2010/wordprocessingShape" mc:Ignorable="w14 w15 w16se w16cid w16 w16cex w16sdtdh wp14">
   <w:footnote w:type="separator" w:id="-1">
     <w:p>
       <w:pPr>
@@ -5874,7 +7067,7 @@
 </file>
 
 <file path=word/header1.xml><?xml version="1.0" encoding="utf-8"?>
-<w:hdr xmlns:wpc="http://schemas.microsoft.com/office/word/2010/wordprocessingCanvas" xmlns:cx="http://schemas.microsoft.com/office/drawing/2014/chartex" xmlns:cx1="http://schemas.microsoft.com/office/drawing/2015/9/8/chartex" xmlns:cx2="http://schemas.microsoft.com/office/drawing/2015/10/21/chartex" xmlns:cx3="http://schemas.microsoft.com/office/drawing/2016/5/9/chartex" xmlns:cx4="http://schemas.microsoft.com/office/drawing/2016/5/10/chartex" xmlns:cx5="http://schemas.microsoft.com/office/drawing/2016/5/11/chartex" xmlns:cx6="http://schemas.microsoft.com/office/drawing/2016/5/12/chartex" xmlns:cx7="http://schemas.microsoft.com/office/drawing/2016/5/13/chartex" xmlns:cx8="http://schemas.microsoft.com/office/drawing/2016/5/14/chartex" xmlns:mc="http://schemas.openxmlformats.org/markup-compatibility/2006" xmlns:aink="http://schemas.microsoft.com/office/drawing/2016/ink" xmlns:am3d="http://schemas.microsoft.com/office/drawing/2017/model3d" xmlns:o="urn:schemas-microsoft-com:office:office" xmlns:oel="http://schemas.microsoft.com/office/2019/extlst" xmlns:r="http://schemas.openxmlformats.org/officeDocument/2006/relationships" xmlns:m="http://schemas.openxmlformats.org/officeDocument/2006/math" xmlns:v="urn:schemas-microsoft-com:vml" xmlns:wp14="http://schemas.microsoft.com/office/word/2010/wordprocessingDrawing" xmlns:wp="http://schemas.openxmlformats.org/drawingml/2006/wordprocessingDrawing" xmlns:w10="urn:schemas-microsoft-com:office:word" xmlns:w="http://schemas.openxmlformats.org/wordprocessingml/2006/main" xmlns:w14="http://schemas.microsoft.com/office/word/2010/wordml" xmlns:w15="http://schemas.microsoft.com/office/word/2012/wordml" xmlns:w16cex="http://schemas.microsoft.com/office/word/2018/wordml/cex" xmlns:w16cid="http://schemas.microsoft.com/office/word/2016/wordml/cid" xmlns:w16="http://schemas.microsoft.com/office/word/2018/wordml" xmlns:w16du="http://schemas.microsoft.com/office/word/2023/wordml/word16du" xmlns:w16sdtdh="http://schemas.microsoft.com/office/word/2020/wordml/sdtdatahash" xmlns:w16sdtfl="http://schemas.microsoft.com/office/word/2024/wordml/sdtformatlock" xmlns:w16se="http://schemas.microsoft.com/office/word/2015/wordml/symex" xmlns:wpg="http://schemas.microsoft.com/office/word/2010/wordprocessingGroup" xmlns:wpi="http://schemas.microsoft.com/office/word/2010/wordprocessingInk" xmlns:wne="http://schemas.microsoft.com/office/word/2006/wordml" xmlns:wps="http://schemas.microsoft.com/office/word/2010/wordprocessingShape" mc:Ignorable="w14 w15 w16se w16cid w16 w16cex w16sdtdh w16sdtfl w16du wp14">
+<w:hdr xmlns:wpc="http://schemas.microsoft.com/office/word/2010/wordprocessingCanvas" xmlns:cx="http://schemas.microsoft.com/office/drawing/2014/chartex" xmlns:cx1="http://schemas.microsoft.com/office/drawing/2015/9/8/chartex" xmlns:cx2="http://schemas.microsoft.com/office/drawing/2015/10/21/chartex" xmlns:cx3="http://schemas.microsoft.com/office/drawing/2016/5/9/chartex" xmlns:cx4="http://schemas.microsoft.com/office/drawing/2016/5/10/chartex" xmlns:cx5="http://schemas.microsoft.com/office/drawing/2016/5/11/chartex" xmlns:cx6="http://schemas.microsoft.com/office/drawing/2016/5/12/chartex" xmlns:cx7="http://schemas.microsoft.com/office/drawing/2016/5/13/chartex" xmlns:cx8="http://schemas.microsoft.com/office/drawing/2016/5/14/chartex" xmlns:mc="http://schemas.openxmlformats.org/markup-compatibility/2006" xmlns:aink="http://schemas.microsoft.com/office/drawing/2016/ink" xmlns:am3d="http://schemas.microsoft.com/office/drawing/2017/model3d" xmlns:o="urn:schemas-microsoft-com:office:office" xmlns:r="http://schemas.openxmlformats.org/officeDocument/2006/relationships" xmlns:m="http://schemas.openxmlformats.org/officeDocument/2006/math" xmlns:v="urn:schemas-microsoft-com:vml" xmlns:wp14="http://schemas.microsoft.com/office/word/2010/wordprocessingDrawing" xmlns:wp="http://schemas.openxmlformats.org/drawingml/2006/wordprocessingDrawing" xmlns:w10="urn:schemas-microsoft-com:office:word" xmlns:w="http://schemas.openxmlformats.org/wordprocessingml/2006/main" xmlns:w14="http://schemas.microsoft.com/office/word/2010/wordml" xmlns:w15="http://schemas.microsoft.com/office/word/2012/wordml" xmlns:w16cex="http://schemas.microsoft.com/office/word/2018/wordml/cex" xmlns:w16cid="http://schemas.microsoft.com/office/word/2016/wordml/cid" xmlns:w16="http://schemas.microsoft.com/office/word/2018/wordml" xmlns:w16sdtdh="http://schemas.microsoft.com/office/word/2020/wordml/sdtdatahash" xmlns:w16se="http://schemas.microsoft.com/office/word/2015/wordml/symex" xmlns:wpg="http://schemas.microsoft.com/office/word/2010/wordprocessingGroup" xmlns:wpi="http://schemas.microsoft.com/office/word/2010/wordprocessingInk" xmlns:wne="http://schemas.microsoft.com/office/word/2006/wordml" xmlns:wps="http://schemas.microsoft.com/office/word/2010/wordprocessingShape" mc:Ignorable="w14 w15 w16se w16cid w16 w16cex w16sdtdh wp14">
   <w:p>
     <w:pPr>
       <w:pStyle w:val="Header"/>
@@ -5884,7 +7077,7 @@
 </file>
 
 <file path=word/styles.xml><?xml version="1.0" encoding="utf-8"?>
-<w:styles xmlns:mc="http://schemas.openxmlformats.org/markup-compatibility/2006" xmlns:r="http://schemas.openxmlformats.org/officeDocument/2006/relationships" xmlns:w="http://schemas.openxmlformats.org/wordprocessingml/2006/main" xmlns:w14="http://schemas.microsoft.com/office/word/2010/wordml" xmlns:w15="http://schemas.microsoft.com/office/word/2012/wordml" xmlns:w16cex="http://schemas.microsoft.com/office/word/2018/wordml/cex" xmlns:w16cid="http://schemas.microsoft.com/office/word/2016/wordml/cid" xmlns:w16="http://schemas.microsoft.com/office/word/2018/wordml" xmlns:w16du="http://schemas.microsoft.com/office/word/2023/wordml/word16du" xmlns:w16sdtdh="http://schemas.microsoft.com/office/word/2020/wordml/sdtdatahash" xmlns:w16sdtfl="http://schemas.microsoft.com/office/word/2024/wordml/sdtformatlock" xmlns:w16se="http://schemas.microsoft.com/office/word/2015/wordml/symex" mc:Ignorable="w14 w15 w16se w16cid w16 w16cex w16sdtdh w16sdtfl w16du">
+<w:styles xmlns:mc="http://schemas.openxmlformats.org/markup-compatibility/2006" xmlns:r="http://schemas.openxmlformats.org/officeDocument/2006/relationships" xmlns:w="http://schemas.openxmlformats.org/wordprocessingml/2006/main" xmlns:w14="http://schemas.microsoft.com/office/word/2010/wordml" xmlns:w15="http://schemas.microsoft.com/office/word/2012/wordml" xmlns:w16cex="http://schemas.microsoft.com/office/word/2018/wordml/cex" xmlns:w16cid="http://schemas.microsoft.com/office/word/2016/wordml/cid" xmlns:w16="http://schemas.microsoft.com/office/word/2018/wordml" xmlns:w16sdtdh="http://schemas.microsoft.com/office/word/2020/wordml/sdtdatahash" xmlns:w16se="http://schemas.microsoft.com/office/word/2015/wordml/symex" mc:Ignorable="w14 w15 w16se w16cid w16 w16cex w16sdtdh">
   <w:docDefaults>
     <w:rPrDefault>
       <w:rPr>

</xml_diff>